<commit_message>
docs: update documents 2nd time
</commit_message>
<xml_diff>
--- a/docs/SRS_BatchETL_MarketAnalysis.docx
+++ b/docs/SRS_BatchETL_MarketAnalysis.docx
@@ -49,6 +49,9 @@
       <w:pPr>
         <w:spacing w:before="40" w:after="40"/>
         <w:jc w:val="center"/>
+        <w:rPr>
+          <w:lang w:val="vi-VN"/>
+        </w:rPr>
       </w:pPr>
       <w:r>
         <w:rPr>
@@ -56,7 +59,15 @@
           <w:sz w:val="24"/>
           <w:szCs w:val="24"/>
         </w:rPr>
-        <w:t>Version 1.0</w:t>
+        <w:t>Version 1.</w:t>
+      </w:r>
+      <w:r>
+        <w:rPr>
+          <w:color w:val="888888"/>
+          <w:sz w:val="24"/>
+          <w:szCs w:val="24"/>
+        </w:rPr>
+        <w:t>1</w:t>
       </w:r>
     </w:p>
     <w:p>
@@ -141,6 +152,9 @@
     <w:p>
       <w:pPr>
         <w:jc w:val="center"/>
+        <w:rPr>
+          <w:lang w:val="vi-VN"/>
+        </w:rPr>
         <w:sectPr>
           <w:pgSz w:w="12240" w:h="15840"/>
           <w:pgMar w:top="1440" w:right="1440" w:bottom="1440" w:left="1440" w:header="708" w:footer="708" w:gutter="0"/>
@@ -154,7 +168,15 @@
           <w:sz w:val="20"/>
           <w:szCs w:val="20"/>
         </w:rPr>
-        <w:t>Status: Draft</w:t>
+        <w:t xml:space="preserve">Status: </w:t>
+      </w:r>
+      <w:r>
+        <w:rPr>
+          <w:color w:val="888888"/>
+          <w:sz w:val="20"/>
+          <w:szCs w:val="20"/>
+        </w:rPr>
+        <w:t>Updated</w:t>
       </w:r>
     </w:p>
     <w:p>
@@ -208,13 +230,12 @@
             </w:tcMar>
           </w:tcPr>
           <w:p>
-            <w:r>
-              <w:rPr>
-                <w:b/>
-                <w:bCs/>
-                <w:color w:val="FFFFFF"/>
-                <w:sz w:val="26"/>
-                <w:szCs w:val="26"/>
+            <w:pPr>
+              <w:pStyle w:val="Heading1"/>
+            </w:pPr>
+            <w:r>
+              <w:rPr>
+                <w:color w:val="FFFFFF" w:themeColor="background1"/>
               </w:rPr>
               <w:t>SECTION 1: PROJECT INTRODUCTION</w:t>
             </w:r>
@@ -234,9 +255,13 @@
     <w:p>
       <w:pPr>
         <w:pStyle w:val="Heading2"/>
+        <w:numPr>
+          <w:ilvl w:val="1"/>
+          <w:numId w:val="6"/>
+        </w:numPr>
       </w:pPr>
       <w:r>
-        <w:t>1.1  Project Overview</w:t>
+        <w:t>Project Overview</w:t>
       </w:r>
     </w:p>
     <w:p>
@@ -267,9 +292,13 @@
     <w:p>
       <w:pPr>
         <w:pStyle w:val="Heading2"/>
+        <w:numPr>
+          <w:ilvl w:val="1"/>
+          <w:numId w:val="6"/>
+        </w:numPr>
       </w:pPr>
       <w:r>
-        <w:t>1.2  Problem Statement</w:t>
+        <w:t>Problem Statement</w:t>
       </w:r>
     </w:p>
     <w:p>
@@ -277,7 +306,16 @@
         <w:spacing w:before="80" w:after="80"/>
       </w:pPr>
       <w:r>
-        <w:t>E-commerce businesses and market analysts lack a systematic, automated way to track competitor pricing, product trends, and stock availability over time. Manual data collection is slow, error-prone, and cannot scale. This project solves:</w:t>
+        <w:t>E-commerce businesses and market analysts lack a systematic, automated way to track competitor pricing, product trends, and stock availability over time. Manual data collection is slow, error-prone, and cannot scale. This project solves</w:t>
+      </w:r>
+      <w:r>
+        <w:rPr>
+          <w:lang w:val="vi-VN"/>
+        </w:rPr>
+        <w:t xml:space="preserve"> the problems of</w:t>
+      </w:r>
+      <w:r>
+        <w:t>:</w:t>
       </w:r>
     </w:p>
     <w:p>
@@ -380,9 +418,13 @@
     <w:p>
       <w:pPr>
         <w:pStyle w:val="Heading2"/>
+        <w:numPr>
+          <w:ilvl w:val="1"/>
+          <w:numId w:val="6"/>
+        </w:numPr>
       </w:pPr>
       <w:r>
-        <w:t>1.3  Project Goals</w:t>
+        <w:t>Project Goals</w:t>
       </w:r>
     </w:p>
     <w:p>
@@ -521,85 +563,162 @@
     <w:p>
       <w:pPr>
         <w:pStyle w:val="Heading2"/>
+        <w:numPr>
+          <w:ilvl w:val="1"/>
+          <w:numId w:val="6"/>
+        </w:numPr>
       </w:pPr>
       <w:r>
-        <w:t>1.4  Scope</w:t>
+        <w:t>Scope</w:t>
       </w:r>
     </w:p>
-    <w:tbl>
-      <w:tblPr>
-        <w:tblStyle w:val="a0"/>
-        <w:tblW w:w="9360" w:type="dxa"/>
-        <w:tblInd w:w="0" w:type="dxa"/>
-        <w:tblBorders>
-          <w:top w:val="single" w:sz="4" w:space="0" w:color="000000"/>
-          <w:left w:val="single" w:sz="4" w:space="0" w:color="000000"/>
-          <w:bottom w:val="single" w:sz="4" w:space="0" w:color="000000"/>
-          <w:right w:val="single" w:sz="4" w:space="0" w:color="000000"/>
-          <w:insideH w:val="single" w:sz="4" w:space="0" w:color="000000"/>
-          <w:insideV w:val="single" w:sz="4" w:space="0" w:color="000000"/>
-        </w:tblBorders>
-        <w:tblLayout w:type="fixed"/>
-        <w:tblLook w:val="0000" w:firstRow="0" w:lastRow="0" w:firstColumn="0" w:lastColumn="0" w:noHBand="0" w:noVBand="0"/>
-      </w:tblPr>
-      <w:tblGrid>
-        <w:gridCol w:w="9360"/>
-      </w:tblGrid>
-      <w:tr>
-        <w:tc>
-          <w:tcPr>
-            <w:tcW w:w="9360" w:type="dxa"/>
-            <w:tcBorders>
-              <w:top w:val="single" w:sz="6" w:space="0" w:color="2E75B6"/>
-              <w:left w:val="single" w:sz="12" w:space="0" w:color="2E75B6"/>
-              <w:bottom w:val="single" w:sz="4" w:space="0" w:color="CCCCCC"/>
-              <w:right w:val="single" w:sz="4" w:space="0" w:color="CCCCCC"/>
-            </w:tcBorders>
-            <w:shd w:val="clear" w:color="auto" w:fill="D6E4F0"/>
-            <w:tcMar>
-              <w:top w:w="120" w:type="dxa"/>
-              <w:left w:w="200" w:type="dxa"/>
-              <w:bottom w:w="120" w:type="dxa"/>
-              <w:right w:w="200" w:type="dxa"/>
-            </w:tcMar>
-          </w:tcPr>
-          <w:p>
-            <w:pPr>
-              <w:spacing w:after="40"/>
-            </w:pPr>
-            <w:r>
-              <w:rPr>
-                <w:b/>
-                <w:bCs/>
-                <w:color w:val="2E75B6"/>
-                <w:sz w:val="20"/>
-                <w:szCs w:val="20"/>
-              </w:rPr>
-              <w:t>IN SCOPE</w:t>
-            </w:r>
-          </w:p>
-          <w:p>
-            <w:r>
-              <w:rPr>
-                <w:sz w:val="21"/>
-                <w:szCs w:val="21"/>
-              </w:rPr>
-              <w:t xml:space="preserve">Automated scraping/API ingestion | Data transformation &amp; cleaning | PostgreSQL storage | Airflow scheduling | Error handling &amp; retry logic | Deduplication | Basic dashboard in </w:t>
-            </w:r>
-            <w:proofErr w:type="spellStart"/>
-            <w:r>
-              <w:rPr>
-                <w:sz w:val="21"/>
-                <w:szCs w:val="21"/>
-              </w:rPr>
-              <w:t>Metabase</w:t>
-            </w:r>
-            <w:proofErr w:type="spellEnd"/>
-          </w:p>
-        </w:tc>
-      </w:tr>
-    </w:tbl>
-    <w:p>
+    <w:p>
+      <w:pPr>
+        <w:spacing w:after="40"/>
+        <w:rPr>
+          <w:lang w:val="vi-VN"/>
+        </w:rPr>
+      </w:pPr>
+    </w:p>
+    <w:p>
+      <w:pPr>
+        <w:pStyle w:val="ListParagraph"/>
+        <w:numPr>
+          <w:ilvl w:val="0"/>
+          <w:numId w:val="4"/>
+        </w:numPr>
+        <w:spacing w:after="40"/>
+        <w:rPr>
+          <w:lang w:val="vi-VN"/>
+        </w:rPr>
+      </w:pPr>
+      <w:r>
+        <w:rPr>
+          <w:lang w:val="vi-VN"/>
+        </w:rPr>
+        <w:t xml:space="preserve">In scope: </w:t>
+      </w:r>
+    </w:p>
+    <w:p>
+      <w:pPr>
+        <w:pStyle w:val="ListParagraph"/>
+        <w:numPr>
+          <w:ilvl w:val="0"/>
+          <w:numId w:val="2"/>
+        </w:numPr>
+      </w:pPr>
+      <w:r>
+        <w:rPr>
+          <w:sz w:val="21"/>
+          <w:szCs w:val="21"/>
+        </w:rPr>
+        <w:t>Automated scraping/API ingestion</w:t>
+      </w:r>
+    </w:p>
+    <w:p>
+      <w:pPr>
+        <w:pStyle w:val="ListParagraph"/>
+        <w:numPr>
+          <w:ilvl w:val="0"/>
+          <w:numId w:val="2"/>
+        </w:numPr>
+      </w:pPr>
+      <w:r>
+        <w:rPr>
+          <w:sz w:val="21"/>
+          <w:szCs w:val="21"/>
+        </w:rPr>
+        <w:t>Data transformation &amp; cleaning</w:t>
+      </w:r>
+    </w:p>
+    <w:p>
+      <w:pPr>
+        <w:pStyle w:val="ListParagraph"/>
+        <w:numPr>
+          <w:ilvl w:val="0"/>
+          <w:numId w:val="2"/>
+        </w:numPr>
+      </w:pPr>
+      <w:r>
+        <w:rPr>
+          <w:sz w:val="21"/>
+          <w:szCs w:val="21"/>
+        </w:rPr>
+        <w:t>PostgreSQL storage</w:t>
+      </w:r>
+    </w:p>
+    <w:p>
+      <w:pPr>
+        <w:pStyle w:val="ListParagraph"/>
+        <w:numPr>
+          <w:ilvl w:val="0"/>
+          <w:numId w:val="2"/>
+        </w:numPr>
+      </w:pPr>
+      <w:r>
+        <w:rPr>
+          <w:sz w:val="21"/>
+          <w:szCs w:val="21"/>
+        </w:rPr>
+        <w:t>Airflow scheduling</w:t>
+      </w:r>
+    </w:p>
+    <w:p>
+      <w:pPr>
+        <w:pStyle w:val="ListParagraph"/>
+        <w:numPr>
+          <w:ilvl w:val="0"/>
+          <w:numId w:val="2"/>
+        </w:numPr>
+      </w:pPr>
+      <w:r>
+        <w:rPr>
+          <w:sz w:val="21"/>
+          <w:szCs w:val="21"/>
+        </w:rPr>
+        <w:t>Error handling &amp; retry logic</w:t>
+      </w:r>
+    </w:p>
+    <w:p>
+      <w:pPr>
+        <w:pStyle w:val="ListParagraph"/>
+        <w:numPr>
+          <w:ilvl w:val="0"/>
+          <w:numId w:val="2"/>
+        </w:numPr>
+      </w:pPr>
+      <w:r>
+        <w:rPr>
+          <w:sz w:val="21"/>
+          <w:szCs w:val="21"/>
+        </w:rPr>
+        <w:t>Deduplication</w:t>
+      </w:r>
+    </w:p>
+    <w:p>
+      <w:pPr>
+        <w:pStyle w:val="ListParagraph"/>
+        <w:numPr>
+          <w:ilvl w:val="0"/>
+          <w:numId w:val="2"/>
+        </w:numPr>
+      </w:pPr>
+      <w:r>
+        <w:rPr>
+          <w:sz w:val="21"/>
+          <w:szCs w:val="21"/>
+        </w:rPr>
+        <w:t xml:space="preserve">Basic dashboard in </w:t>
+      </w:r>
+      <w:proofErr w:type="spellStart"/>
+      <w:r>
+        <w:rPr>
+          <w:sz w:val="21"/>
+          <w:szCs w:val="21"/>
+        </w:rPr>
+        <w:t>Metabase</w:t>
+      </w:r>
+      <w:proofErr w:type="spellEnd"/>
       <w:r>
         <w:rPr>
           <w:sz w:val="12"/>
@@ -608,70 +727,127 @@
         <w:t xml:space="preserve"> </w:t>
       </w:r>
     </w:p>
-    <w:tbl>
-      <w:tblPr>
-        <w:tblStyle w:val="a1"/>
-        <w:tblW w:w="9360" w:type="dxa"/>
-        <w:tblInd w:w="0" w:type="dxa"/>
-        <w:tblBorders>
-          <w:top w:val="single" w:sz="4" w:space="0" w:color="000000"/>
-          <w:left w:val="single" w:sz="4" w:space="0" w:color="000000"/>
-          <w:bottom w:val="single" w:sz="4" w:space="0" w:color="000000"/>
-          <w:right w:val="single" w:sz="4" w:space="0" w:color="000000"/>
-          <w:insideH w:val="single" w:sz="4" w:space="0" w:color="000000"/>
-          <w:insideV w:val="single" w:sz="4" w:space="0" w:color="000000"/>
-        </w:tblBorders>
-        <w:tblLayout w:type="fixed"/>
-        <w:tblLook w:val="0000" w:firstRow="0" w:lastRow="0" w:firstColumn="0" w:lastColumn="0" w:noHBand="0" w:noVBand="0"/>
-      </w:tblPr>
-      <w:tblGrid>
-        <w:gridCol w:w="9360"/>
-      </w:tblGrid>
-      <w:tr>
-        <w:tc>
-          <w:tcPr>
-            <w:tcW w:w="9360" w:type="dxa"/>
-            <w:tcBorders>
-              <w:top w:val="single" w:sz="6" w:space="0" w:color="2E75B6"/>
-              <w:left w:val="single" w:sz="12" w:space="0" w:color="2E75B6"/>
-              <w:bottom w:val="single" w:sz="4" w:space="0" w:color="CCCCCC"/>
-              <w:right w:val="single" w:sz="4" w:space="0" w:color="CCCCCC"/>
-            </w:tcBorders>
-            <w:shd w:val="clear" w:color="auto" w:fill="FFF3CD"/>
-            <w:tcMar>
-              <w:top w:w="120" w:type="dxa"/>
-              <w:left w:w="200" w:type="dxa"/>
-              <w:bottom w:w="120" w:type="dxa"/>
-              <w:right w:w="200" w:type="dxa"/>
-            </w:tcMar>
-          </w:tcPr>
-          <w:p>
-            <w:pPr>
-              <w:spacing w:after="40"/>
-            </w:pPr>
-            <w:r>
-              <w:rPr>
-                <w:b/>
-                <w:bCs/>
-                <w:color w:val="2E75B6"/>
-                <w:sz w:val="20"/>
-                <w:szCs w:val="20"/>
-              </w:rPr>
-              <w:t>OUT OF SCOPE</w:t>
-            </w:r>
-          </w:p>
-          <w:p>
-            <w:r>
-              <w:rPr>
-                <w:sz w:val="21"/>
-                <w:szCs w:val="21"/>
-              </w:rPr>
-              <w:t>Real-time streaming (Kafka/Flink) | User authentication/authorization | Mobile application | Machine learning predictions | Payment or transaction processing</w:t>
-            </w:r>
-          </w:p>
-        </w:tc>
-      </w:tr>
-    </w:tbl>
+    <w:p>
+      <w:pPr>
+        <w:rPr>
+          <w:lang w:val="vi-VN"/>
+        </w:rPr>
+      </w:pPr>
+    </w:p>
+    <w:p>
+      <w:pPr>
+        <w:pStyle w:val="ListParagraph"/>
+        <w:numPr>
+          <w:ilvl w:val="0"/>
+          <w:numId w:val="3"/>
+        </w:numPr>
+        <w:rPr>
+          <w:lang w:val="vi-VN"/>
+        </w:rPr>
+      </w:pPr>
+      <w:r>
+        <w:rPr>
+          <w:lang w:val="vi-VN"/>
+        </w:rPr>
+        <w:t>Out of scope (further development)</w:t>
+      </w:r>
+    </w:p>
+    <w:p>
+      <w:pPr>
+        <w:pStyle w:val="ListParagraph"/>
+        <w:numPr>
+          <w:ilvl w:val="0"/>
+          <w:numId w:val="5"/>
+        </w:numPr>
+        <w:rPr>
+          <w:lang w:val="vi-VN"/>
+        </w:rPr>
+      </w:pPr>
+      <w:r>
+        <w:rPr>
+          <w:sz w:val="21"/>
+          <w:szCs w:val="21"/>
+        </w:rPr>
+        <w:t>Real-time streaming (Kafka/Flink)</w:t>
+      </w:r>
+    </w:p>
+    <w:p>
+      <w:pPr>
+        <w:pStyle w:val="ListParagraph"/>
+        <w:numPr>
+          <w:ilvl w:val="0"/>
+          <w:numId w:val="5"/>
+        </w:numPr>
+        <w:rPr>
+          <w:lang w:val="vi-VN"/>
+        </w:rPr>
+      </w:pPr>
+      <w:r>
+        <w:rPr>
+          <w:sz w:val="21"/>
+          <w:szCs w:val="21"/>
+        </w:rPr>
+        <w:lastRenderedPageBreak/>
+        <w:t>User authentication/authorization</w:t>
+      </w:r>
+    </w:p>
+    <w:p>
+      <w:pPr>
+        <w:pStyle w:val="ListParagraph"/>
+        <w:numPr>
+          <w:ilvl w:val="0"/>
+          <w:numId w:val="5"/>
+        </w:numPr>
+        <w:rPr>
+          <w:lang w:val="vi-VN"/>
+        </w:rPr>
+      </w:pPr>
+      <w:r>
+        <w:rPr>
+          <w:sz w:val="21"/>
+          <w:szCs w:val="21"/>
+        </w:rPr>
+        <w:t>Mobile application</w:t>
+      </w:r>
+    </w:p>
+    <w:p>
+      <w:pPr>
+        <w:pStyle w:val="ListParagraph"/>
+        <w:numPr>
+          <w:ilvl w:val="0"/>
+          <w:numId w:val="5"/>
+        </w:numPr>
+        <w:rPr>
+          <w:lang w:val="vi-VN"/>
+        </w:rPr>
+      </w:pPr>
+      <w:r>
+        <w:rPr>
+          <w:sz w:val="21"/>
+          <w:szCs w:val="21"/>
+        </w:rPr>
+        <w:t>Machine learning predictions</w:t>
+      </w:r>
+    </w:p>
+    <w:p>
+      <w:pPr>
+        <w:pStyle w:val="ListParagraph"/>
+        <w:numPr>
+          <w:ilvl w:val="0"/>
+          <w:numId w:val="5"/>
+        </w:numPr>
+        <w:rPr>
+          <w:lang w:val="vi-VN"/>
+        </w:rPr>
+      </w:pPr>
+      <w:r>
+        <w:rPr>
+          <w:sz w:val="21"/>
+          <w:szCs w:val="21"/>
+        </w:rPr>
+        <w:t>Payment or transaction processing</w:t>
+      </w:r>
+    </w:p>
     <w:p>
       <w:r>
         <w:rPr>
@@ -684,17 +860,19 @@
     <w:p>
       <w:pPr>
         <w:pStyle w:val="Heading2"/>
+        <w:numPr>
+          <w:ilvl w:val="1"/>
+          <w:numId w:val="6"/>
+        </w:numPr>
+        <w:rPr>
+          <w:lang w:val="vi-VN"/>
+        </w:rPr>
       </w:pPr>
       <w:r>
-        <w:t>1.5  Recommended Data Source</w:t>
+        <w:t>Recommended</w:t>
       </w:r>
-    </w:p>
-    <w:p>
-      <w:pPr>
-        <w:spacing w:before="80" w:after="80"/>
-      </w:pPr>
       <w:r>
-        <w:t>Based on the project requirements, the following data sources are recommended (in priority order):</w:t>
+        <w:t xml:space="preserve"> Data Source</w:t>
       </w:r>
     </w:p>
     <w:tbl>
@@ -748,7 +926,6 @@
                 <w:sz w:val="20"/>
                 <w:szCs w:val="20"/>
               </w:rPr>
-              <w:lastRenderedPageBreak/>
               <w:t>Option</w:t>
             </w:r>
           </w:p>
@@ -1592,46 +1769,9 @@
     <w:p>
       <w:pPr>
         <w:spacing w:before="80" w:after="80"/>
-      </w:pPr>
-    </w:p>
-    <w:p>
-      <w:pPr>
-        <w:spacing w:before="80" w:after="80"/>
-      </w:pPr>
-    </w:p>
-    <w:p>
-      <w:pPr>
-        <w:spacing w:before="80" w:after="80"/>
-      </w:pPr>
-    </w:p>
-    <w:p>
-      <w:pPr>
-        <w:spacing w:before="80" w:after="80"/>
-      </w:pPr>
-    </w:p>
-    <w:p>
-      <w:pPr>
-        <w:spacing w:before="80" w:after="80"/>
-      </w:pPr>
-    </w:p>
-    <w:p>
-      <w:pPr>
-        <w:spacing w:before="80" w:after="80"/>
-      </w:pPr>
-    </w:p>
-    <w:p>
-      <w:pPr>
-        <w:spacing w:before="80" w:after="80"/>
-      </w:pPr>
-    </w:p>
-    <w:p>
-      <w:pPr>
-        <w:spacing w:before="80" w:after="80"/>
-      </w:pPr>
-    </w:p>
-    <w:p>
-      <w:pPr>
-        <w:spacing w:before="80" w:after="80"/>
+        <w:rPr>
+          <w:lang w:val="vi-VN"/>
+        </w:rPr>
       </w:pPr>
     </w:p>
     <w:p>
@@ -1681,13 +1821,12 @@
             </w:tcMar>
           </w:tcPr>
           <w:p>
-            <w:r>
-              <w:rPr>
-                <w:b/>
-                <w:bCs/>
-                <w:color w:val="FFFFFF"/>
-                <w:sz w:val="26"/>
-                <w:szCs w:val="26"/>
+            <w:pPr>
+              <w:pStyle w:val="Heading1"/>
+            </w:pPr>
+            <w:r>
+              <w:rPr>
+                <w:color w:val="FFFFFF" w:themeColor="background1"/>
               </w:rPr>
               <w:t>SECTION 2: STAKEHOLDERS &amp; USER PERSONAS</w:t>
             </w:r>
@@ -1709,7 +1848,7 @@
         <w:pStyle w:val="Heading2"/>
       </w:pPr>
       <w:r>
-        <w:t>2.1  Stakeholders</w:t>
+        <w:t>2.1. Stakeholders</w:t>
       </w:r>
     </w:p>
     <w:tbl>
@@ -2175,7 +2314,10 @@
         <w:pStyle w:val="Heading2"/>
       </w:pPr>
       <w:r>
-        <w:t>2.2  User Stories</w:t>
+        <w:t>2.2. User</w:t>
+      </w:r>
+      <w:r>
+        <w:t xml:space="preserve"> Stories</w:t>
       </w:r>
     </w:p>
     <w:p>
@@ -2625,7 +2767,13 @@
         <w:pStyle w:val="Heading2"/>
       </w:pPr>
       <w:r>
-        <w:t>3.1  Data Extraction Module</w:t>
+        <w:t>3.1</w:t>
+      </w:r>
+      <w:r>
+        <w:t xml:space="preserve">. </w:t>
+      </w:r>
+      <w:r>
+        <w:t>Data Extraction Module</w:t>
       </w:r>
     </w:p>
     <w:tbl>
@@ -2795,7 +2943,21 @@
                 <w:sz w:val="20"/>
                 <w:szCs w:val="20"/>
               </w:rPr>
-              <w:t>System SHALL connect to at least one configured data source (API or web scraping target)</w:t>
+              <w:t xml:space="preserve">System </w:t>
+            </w:r>
+            <w:r>
+              <w:rPr>
+                <w:sz w:val="20"/>
+                <w:szCs w:val="20"/>
+              </w:rPr>
+              <w:t>shall</w:t>
+            </w:r>
+            <w:r>
+              <w:rPr>
+                <w:sz w:val="20"/>
+                <w:szCs w:val="20"/>
+              </w:rPr>
+              <w:t xml:space="preserve"> connect to at least one configured data source (API or web scraping target)</w:t>
             </w:r>
           </w:p>
         </w:tc>
@@ -2878,7 +3040,21 @@
                 <w:sz w:val="20"/>
                 <w:szCs w:val="20"/>
               </w:rPr>
-              <w:t xml:space="preserve">System SHALL extract: </w:t>
+              <w:t xml:space="preserve">System </w:t>
+            </w:r>
+            <w:r>
+              <w:rPr>
+                <w:sz w:val="20"/>
+                <w:szCs w:val="20"/>
+              </w:rPr>
+              <w:t>shall</w:t>
+            </w:r>
+            <w:r>
+              <w:rPr>
+                <w:sz w:val="20"/>
+                <w:szCs w:val="20"/>
+              </w:rPr>
+              <w:t xml:space="preserve"> extract: </w:t>
             </w:r>
             <w:proofErr w:type="spellStart"/>
             <w:r>
@@ -3018,7 +3194,21 @@
                 <w:sz w:val="20"/>
                 <w:szCs w:val="20"/>
               </w:rPr>
-              <w:t xml:space="preserve">System SHALL record </w:t>
+              <w:t xml:space="preserve">System </w:t>
+            </w:r>
+            <w:r>
+              <w:rPr>
+                <w:sz w:val="20"/>
+                <w:szCs w:val="20"/>
+              </w:rPr>
+              <w:t>shall</w:t>
+            </w:r>
+            <w:r>
+              <w:rPr>
+                <w:sz w:val="20"/>
+                <w:szCs w:val="20"/>
+              </w:rPr>
+              <w:t xml:space="preserve"> record </w:t>
             </w:r>
             <w:proofErr w:type="spellStart"/>
             <w:r>
@@ -3117,7 +3307,21 @@
                 <w:sz w:val="20"/>
                 <w:szCs w:val="20"/>
               </w:rPr>
-              <w:t>System SHALL support configurable extraction targets via .env or config file (no hardcoded URLs/tokens)</w:t>
+              <w:t xml:space="preserve">System </w:t>
+            </w:r>
+            <w:r>
+              <w:rPr>
+                <w:sz w:val="20"/>
+                <w:szCs w:val="20"/>
+              </w:rPr>
+              <w:t>shall</w:t>
+            </w:r>
+            <w:r>
+              <w:rPr>
+                <w:sz w:val="20"/>
+                <w:szCs w:val="20"/>
+              </w:rPr>
+              <w:t xml:space="preserve"> support configurable extraction targets via env or config file (no hardcoded URLs/tokens)</w:t>
             </w:r>
           </w:p>
         </w:tc>
@@ -3200,7 +3404,21 @@
                 <w:sz w:val="20"/>
                 <w:szCs w:val="20"/>
               </w:rPr>
-              <w:t>System SHALL implement pagination to handle large result sets (&gt;100 items)</w:t>
+              <w:t xml:space="preserve">System </w:t>
+            </w:r>
+            <w:r>
+              <w:rPr>
+                <w:sz w:val="20"/>
+                <w:szCs w:val="20"/>
+              </w:rPr>
+              <w:t>shall</w:t>
+            </w:r>
+            <w:r>
+              <w:rPr>
+                <w:sz w:val="20"/>
+                <w:szCs w:val="20"/>
+              </w:rPr>
+              <w:t xml:space="preserve"> implement pagination to handle large result sets (&gt;100 items)</w:t>
             </w:r>
           </w:p>
         </w:tc>
@@ -3283,7 +3501,21 @@
                 <w:sz w:val="20"/>
                 <w:szCs w:val="20"/>
               </w:rPr>
-              <w:t>System SHALL respect rate limits (min. 1s delay between requests for scraping)</w:t>
+              <w:t xml:space="preserve">System </w:t>
+            </w:r>
+            <w:r>
+              <w:rPr>
+                <w:sz w:val="20"/>
+                <w:szCs w:val="20"/>
+              </w:rPr>
+              <w:t>shall</w:t>
+            </w:r>
+            <w:r>
+              <w:rPr>
+                <w:sz w:val="20"/>
+                <w:szCs w:val="20"/>
+              </w:rPr>
+              <w:t xml:space="preserve"> respect rate limits (min. 1s delay between requests for scraping)</w:t>
             </w:r>
           </w:p>
         </w:tc>
@@ -3366,7 +3598,21 @@
                 <w:sz w:val="20"/>
                 <w:szCs w:val="20"/>
               </w:rPr>
-              <w:t>System SHALL save raw extracted data to a staging area before transformation</w:t>
+              <w:t xml:space="preserve">System </w:t>
+            </w:r>
+            <w:r>
+              <w:rPr>
+                <w:sz w:val="20"/>
+                <w:szCs w:val="20"/>
+              </w:rPr>
+              <w:t>shall</w:t>
+            </w:r>
+            <w:r>
+              <w:rPr>
+                <w:sz w:val="20"/>
+                <w:szCs w:val="20"/>
+              </w:rPr>
+              <w:t xml:space="preserve"> save raw extracted data to a staging area before transformation</w:t>
             </w:r>
           </w:p>
         </w:tc>
@@ -3413,7 +3659,13 @@
         <w:pStyle w:val="Heading2"/>
       </w:pPr>
       <w:r>
-        <w:t>3.2  Data Transformation Module</w:t>
+        <w:t>3.2</w:t>
+      </w:r>
+      <w:r>
+        <w:t xml:space="preserve">. </w:t>
+      </w:r>
+      <w:r>
+        <w:t>Data Transformation Module</w:t>
       </w:r>
     </w:p>
     <w:tbl>
@@ -3583,7 +3835,21 @@
                 <w:sz w:val="20"/>
                 <w:szCs w:val="20"/>
               </w:rPr>
-              <w:t xml:space="preserve">System SHALL drop records where </w:t>
+              <w:t xml:space="preserve">System </w:t>
+            </w:r>
+            <w:r>
+              <w:rPr>
+                <w:sz w:val="20"/>
+                <w:szCs w:val="20"/>
+              </w:rPr>
+              <w:t>shall</w:t>
+            </w:r>
+            <w:r>
+              <w:rPr>
+                <w:sz w:val="20"/>
+                <w:szCs w:val="20"/>
+              </w:rPr>
+              <w:t xml:space="preserve"> drop records where </w:t>
             </w:r>
             <w:proofErr w:type="spellStart"/>
             <w:r>
@@ -3682,7 +3948,21 @@
                 <w:sz w:val="20"/>
                 <w:szCs w:val="20"/>
               </w:rPr>
-              <w:t>System SHALL normalize price fields to float with 2 decimal places</w:t>
+              <w:t xml:space="preserve">System </w:t>
+            </w:r>
+            <w:r>
+              <w:rPr>
+                <w:sz w:val="20"/>
+                <w:szCs w:val="20"/>
+              </w:rPr>
+              <w:t>shall</w:t>
+            </w:r>
+            <w:r>
+              <w:rPr>
+                <w:sz w:val="20"/>
+                <w:szCs w:val="20"/>
+              </w:rPr>
+              <w:t xml:space="preserve"> normalize price fields to float with 2 decimal places</w:t>
             </w:r>
           </w:p>
         </w:tc>
@@ -3772,7 +4052,22 @@
                     <w:sz w:val="20"/>
                     <w:szCs w:val="20"/>
                   </w:rPr>
-                  <w:t>System SHALL standardize category names to lowercase with underscores (e.g., 'Men Clothing' → '</w:t>
+                  <w:t xml:space="preserve">System </w:t>
+                </w:r>
+                <w:r>
+                  <w:rPr>
+                    <w:sz w:val="20"/>
+                    <w:szCs w:val="20"/>
+                  </w:rPr>
+                  <w:t>shall</w:t>
+                </w:r>
+                <w:r>
+                  <w:rPr>
+                    <w:rFonts w:ascii="Arial Unicode MS" w:eastAsia="Arial Unicode MS" w:hAnsi="Arial Unicode MS" w:cs="Arial Unicode MS"/>
+                    <w:sz w:val="20"/>
+                    <w:szCs w:val="20"/>
+                  </w:rPr>
+                  <w:t xml:space="preserve"> standardize category names to lowercase with underscores (e.g., 'Men Clothing' → '</w:t>
                 </w:r>
                 <w:proofErr w:type="spellStart"/>
                 <w:r>
@@ -3875,7 +4170,21 @@
                 <w:sz w:val="20"/>
                 <w:szCs w:val="20"/>
               </w:rPr>
-              <w:t>System SHALL deduplicate records based on (</w:t>
+              <w:t xml:space="preserve">System </w:t>
+            </w:r>
+            <w:r>
+              <w:rPr>
+                <w:sz w:val="20"/>
+                <w:szCs w:val="20"/>
+              </w:rPr>
+              <w:t>shall</w:t>
+            </w:r>
+            <w:r>
+              <w:rPr>
+                <w:sz w:val="20"/>
+                <w:szCs w:val="20"/>
+              </w:rPr>
+              <w:t xml:space="preserve"> deduplicate records based on (</w:t>
             </w:r>
             <w:proofErr w:type="spellStart"/>
             <w:r>
@@ -3990,7 +4299,21 @@
                 <w:sz w:val="20"/>
                 <w:szCs w:val="20"/>
               </w:rPr>
-              <w:t>System SHALL cap rating values to 0.0–5.0 range; flag out-of-range values in logs</w:t>
+              <w:t xml:space="preserve">System </w:t>
+            </w:r>
+            <w:r>
+              <w:rPr>
+                <w:sz w:val="20"/>
+                <w:szCs w:val="20"/>
+              </w:rPr>
+              <w:t>shall</w:t>
+            </w:r>
+            <w:r>
+              <w:rPr>
+                <w:sz w:val="20"/>
+                <w:szCs w:val="20"/>
+              </w:rPr>
+              <w:t xml:space="preserve"> cap rating values to 0.0–5.0 range; flag out-of-range values in logs</w:t>
             </w:r>
           </w:p>
         </w:tc>
@@ -4073,7 +4396,21 @@
                 <w:sz w:val="20"/>
                 <w:szCs w:val="20"/>
               </w:rPr>
-              <w:t xml:space="preserve">System SHALL add </w:t>
+              <w:t xml:space="preserve">System </w:t>
+            </w:r>
+            <w:r>
+              <w:rPr>
+                <w:sz w:val="20"/>
+                <w:szCs w:val="20"/>
+              </w:rPr>
+              <w:t>shall</w:t>
+            </w:r>
+            <w:r>
+              <w:rPr>
+                <w:sz w:val="20"/>
+                <w:szCs w:val="20"/>
+              </w:rPr>
+              <w:t xml:space="preserve"> add </w:t>
             </w:r>
             <w:proofErr w:type="spellStart"/>
             <w:r>
@@ -4172,7 +4509,21 @@
                 <w:sz w:val="20"/>
                 <w:szCs w:val="20"/>
               </w:rPr>
-              <w:t>System SHALL log count of rows: extracted, cleaned, rejected, loaded per run</w:t>
+              <w:t xml:space="preserve">System </w:t>
+            </w:r>
+            <w:r>
+              <w:rPr>
+                <w:sz w:val="20"/>
+                <w:szCs w:val="20"/>
+              </w:rPr>
+              <w:t>shall</w:t>
+            </w:r>
+            <w:r>
+              <w:rPr>
+                <w:sz w:val="20"/>
+                <w:szCs w:val="20"/>
+              </w:rPr>
+              <w:t xml:space="preserve"> log count of rows: extracted, cleaned, rejected, loaded per run</w:t>
             </w:r>
           </w:p>
         </w:tc>
@@ -4255,7 +4606,21 @@
                 <w:sz w:val="20"/>
                 <w:szCs w:val="20"/>
               </w:rPr>
-              <w:t>System SHALL support schema validation against an expected column/type spec</w:t>
+              <w:t xml:space="preserve">System </w:t>
+            </w:r>
+            <w:r>
+              <w:rPr>
+                <w:sz w:val="20"/>
+                <w:szCs w:val="20"/>
+              </w:rPr>
+              <w:t>shall</w:t>
+            </w:r>
+            <w:r>
+              <w:rPr>
+                <w:sz w:val="20"/>
+                <w:szCs w:val="20"/>
+              </w:rPr>
+              <w:t xml:space="preserve"> support schema validation against an expected column/type spec</w:t>
             </w:r>
           </w:p>
         </w:tc>
@@ -4303,7 +4668,13 @@
       </w:pPr>
       <w:r>
         <w:lastRenderedPageBreak/>
-        <w:t>3.3  Data Loading Module</w:t>
+        <w:t>3.3</w:t>
+      </w:r>
+      <w:r>
+        <w:t xml:space="preserve">. </w:t>
+      </w:r>
+      <w:r>
+        <w:t>Data Loading Module</w:t>
       </w:r>
     </w:p>
     <w:tbl>
@@ -4473,7 +4844,21 @@
                 <w:sz w:val="20"/>
                 <w:szCs w:val="20"/>
               </w:rPr>
-              <w:t xml:space="preserve">System SHALL load transformed records into PostgreSQL table: </w:t>
+              <w:t xml:space="preserve">System </w:t>
+            </w:r>
+            <w:r>
+              <w:rPr>
+                <w:sz w:val="20"/>
+                <w:szCs w:val="20"/>
+              </w:rPr>
+              <w:t>shall</w:t>
+            </w:r>
+            <w:r>
+              <w:rPr>
+                <w:sz w:val="20"/>
+                <w:szCs w:val="20"/>
+              </w:rPr>
+              <w:t xml:space="preserve"> load transformed records into PostgreSQL table: </w:t>
             </w:r>
             <w:proofErr w:type="spellStart"/>
             <w:r>
@@ -4565,7 +4950,21 @@
                 <w:sz w:val="20"/>
                 <w:szCs w:val="20"/>
               </w:rPr>
-              <w:t>System SHALL use UPSERT logic (INSERT ... ON CONFLICT DO UPDATE) to avoid duplicates on re-run</w:t>
+              <w:t xml:space="preserve">System </w:t>
+            </w:r>
+            <w:r>
+              <w:rPr>
+                <w:sz w:val="20"/>
+                <w:szCs w:val="20"/>
+              </w:rPr>
+              <w:t>shall</w:t>
+            </w:r>
+            <w:r>
+              <w:rPr>
+                <w:sz w:val="20"/>
+                <w:szCs w:val="20"/>
+              </w:rPr>
+              <w:t xml:space="preserve"> use UPSERT logic (INSERT ... ON CONFLICT DO UPDATE) to avoid duplicates on re-run</w:t>
             </w:r>
           </w:p>
         </w:tc>
@@ -4648,7 +5047,21 @@
                 <w:sz w:val="20"/>
                 <w:szCs w:val="20"/>
               </w:rPr>
-              <w:t xml:space="preserve">System SHALL maintain a separate </w:t>
+              <w:t xml:space="preserve">System </w:t>
+            </w:r>
+            <w:r>
+              <w:rPr>
+                <w:sz w:val="20"/>
+                <w:szCs w:val="20"/>
+              </w:rPr>
+              <w:t>shall</w:t>
+            </w:r>
+            <w:r>
+              <w:rPr>
+                <w:sz w:val="20"/>
+                <w:szCs w:val="20"/>
+              </w:rPr>
+              <w:t xml:space="preserve"> maintain a separate </w:t>
             </w:r>
             <w:proofErr w:type="spellStart"/>
             <w:r>
@@ -4763,7 +5176,21 @@
                 <w:sz w:val="20"/>
                 <w:szCs w:val="20"/>
               </w:rPr>
-              <w:t>System SHALL rollback load transaction on any error; partial loads are not permitted</w:t>
+              <w:t xml:space="preserve">System </w:t>
+            </w:r>
+            <w:r>
+              <w:rPr>
+                <w:sz w:val="20"/>
+                <w:szCs w:val="20"/>
+              </w:rPr>
+              <w:t>shall</w:t>
+            </w:r>
+            <w:r>
+              <w:rPr>
+                <w:sz w:val="20"/>
+                <w:szCs w:val="20"/>
+              </w:rPr>
+              <w:t xml:space="preserve"> rollback load transaction on any error; partial loads are not permitted</w:t>
             </w:r>
           </w:p>
         </w:tc>
@@ -4846,7 +5273,21 @@
                 <w:sz w:val="20"/>
                 <w:szCs w:val="20"/>
               </w:rPr>
-              <w:t>System SHALL archive raw extracted files (JSON/CSV) to a local or cloud storage path</w:t>
+              <w:t xml:space="preserve">System </w:t>
+            </w:r>
+            <w:r>
+              <w:rPr>
+                <w:sz w:val="20"/>
+                <w:szCs w:val="20"/>
+              </w:rPr>
+              <w:t>shall</w:t>
+            </w:r>
+            <w:r>
+              <w:rPr>
+                <w:sz w:val="20"/>
+                <w:szCs w:val="20"/>
+              </w:rPr>
+              <w:t xml:space="preserve"> archive raw extracted files (JSON/CSV) to a local or cloud storage path</w:t>
             </w:r>
           </w:p>
         </w:tc>
@@ -4893,7 +5334,13 @@
         <w:pStyle w:val="Heading2"/>
       </w:pPr>
       <w:r>
-        <w:t>3.4  Orchestration (Apache Airflow)</w:t>
+        <w:t>3.4</w:t>
+      </w:r>
+      <w:r>
+        <w:t xml:space="preserve">. </w:t>
+      </w:r>
+      <w:r>
+        <w:t>Orchestration (Apache Airflow)</w:t>
       </w:r>
     </w:p>
     <w:tbl>
@@ -5063,7 +5510,21 @@
                 <w:sz w:val="20"/>
                 <w:szCs w:val="20"/>
               </w:rPr>
-              <w:t xml:space="preserve">System SHALL define an Airflow DAG: </w:t>
+              <w:t xml:space="preserve">System </w:t>
+            </w:r>
+            <w:r>
+              <w:rPr>
+                <w:sz w:val="20"/>
+                <w:szCs w:val="20"/>
+              </w:rPr>
+              <w:t>shall</w:t>
+            </w:r>
+            <w:r>
+              <w:rPr>
+                <w:sz w:val="20"/>
+                <w:szCs w:val="20"/>
+              </w:rPr>
+              <w:t xml:space="preserve"> define an Airflow DAG: </w:t>
             </w:r>
             <w:proofErr w:type="spellStart"/>
             <w:r>
@@ -5185,7 +5646,22 @@
                     <w:sz w:val="20"/>
                     <w:szCs w:val="20"/>
                   </w:rPr>
-                  <w:t xml:space="preserve">DAG SHALL contain tasks: </w:t>
+                  <w:t xml:space="preserve">DAG </w:t>
+                </w:r>
+                <w:r>
+                  <w:rPr>
+                    <w:sz w:val="20"/>
+                    <w:szCs w:val="20"/>
+                  </w:rPr>
+                  <w:t>shall</w:t>
+                </w:r>
+                <w:r>
+                  <w:rPr>
+                    <w:rFonts w:ascii="Arial Unicode MS" w:eastAsia="Arial Unicode MS" w:hAnsi="Arial Unicode MS" w:cs="Arial Unicode MS"/>
+                    <w:sz w:val="20"/>
+                    <w:szCs w:val="20"/>
+                  </w:rPr>
+                  <w:t xml:space="preserve"> contain tasks: </w:t>
                 </w:r>
                 <w:proofErr w:type="spellStart"/>
                 <w:r>
@@ -5352,7 +5828,35 @@
                 <w:sz w:val="20"/>
                 <w:szCs w:val="20"/>
               </w:rPr>
-              <w:t>Each task SHALL be independent and retry-able; task failures SHALL NOT cascade unless configured</w:t>
+              <w:t xml:space="preserve">Each task </w:t>
+            </w:r>
+            <w:r>
+              <w:rPr>
+                <w:sz w:val="20"/>
+                <w:szCs w:val="20"/>
+              </w:rPr>
+              <w:t>shall</w:t>
+            </w:r>
+            <w:r>
+              <w:rPr>
+                <w:sz w:val="20"/>
+                <w:szCs w:val="20"/>
+              </w:rPr>
+              <w:t xml:space="preserve"> be independent and retry-able; task failures </w:t>
+            </w:r>
+            <w:r>
+              <w:rPr>
+                <w:sz w:val="20"/>
+                <w:szCs w:val="20"/>
+              </w:rPr>
+              <w:t>shall</w:t>
+            </w:r>
+            <w:r>
+              <w:rPr>
+                <w:sz w:val="20"/>
+                <w:szCs w:val="20"/>
+              </w:rPr>
+              <w:t xml:space="preserve"> NOT cascade unless configured</w:t>
             </w:r>
           </w:p>
         </w:tc>
@@ -5435,7 +5939,21 @@
                 <w:sz w:val="20"/>
                 <w:szCs w:val="20"/>
               </w:rPr>
-              <w:t>System SHALL support backfill mode (catchup=True) with date-aware execution</w:t>
+              <w:t xml:space="preserve">System </w:t>
+            </w:r>
+            <w:r>
+              <w:rPr>
+                <w:sz w:val="20"/>
+                <w:szCs w:val="20"/>
+              </w:rPr>
+              <w:t>shall</w:t>
+            </w:r>
+            <w:r>
+              <w:rPr>
+                <w:sz w:val="20"/>
+                <w:szCs w:val="20"/>
+              </w:rPr>
+              <w:t xml:space="preserve"> support backfill mode (catchup=True) with date-aware execution</w:t>
             </w:r>
           </w:p>
         </w:tc>
@@ -5518,7 +6036,21 @@
                 <w:sz w:val="20"/>
                 <w:szCs w:val="20"/>
               </w:rPr>
-              <w:t>System SHALL send an email or Slack notification on DAG success AND failure</w:t>
+              <w:t xml:space="preserve">System </w:t>
+            </w:r>
+            <w:r>
+              <w:rPr>
+                <w:sz w:val="20"/>
+                <w:szCs w:val="20"/>
+              </w:rPr>
+              <w:t>shall</w:t>
+            </w:r>
+            <w:r>
+              <w:rPr>
+                <w:sz w:val="20"/>
+                <w:szCs w:val="20"/>
+              </w:rPr>
+              <w:t xml:space="preserve"> send an email or Slack notification on DAG success AND failure</w:t>
             </w:r>
           </w:p>
         </w:tc>
@@ -5601,7 +6133,21 @@
                 <w:sz w:val="20"/>
                 <w:szCs w:val="20"/>
               </w:rPr>
-              <w:t>Airflow Variables/Connections SHALL be used for all credentials; no hardcoded secrets in DAG code</w:t>
+              <w:t xml:space="preserve">Airflow Variables/Connections </w:t>
+            </w:r>
+            <w:r>
+              <w:rPr>
+                <w:sz w:val="20"/>
+                <w:szCs w:val="20"/>
+              </w:rPr>
+              <w:t>shall</w:t>
+            </w:r>
+            <w:r>
+              <w:rPr>
+                <w:sz w:val="20"/>
+                <w:szCs w:val="20"/>
+              </w:rPr>
+              <w:t xml:space="preserve"> be used for all credentials; no hardcoded secrets in DAG code</w:t>
             </w:r>
           </w:p>
         </w:tc>
@@ -5648,7 +6194,7 @@
         <w:pStyle w:val="Heading2"/>
       </w:pPr>
       <w:r>
-        <w:t>3.5  Error Handling Requirements</w:t>
+        <w:t>3.5. Error Handling Requirements</w:t>
       </w:r>
     </w:p>
     <w:p>
@@ -6537,7 +7083,13 @@
         <w:pStyle w:val="Heading2"/>
       </w:pPr>
       <w:r>
-        <w:t>3.6  Visualization &amp; Reporting</w:t>
+        <w:t>3.6</w:t>
+      </w:r>
+      <w:r>
+        <w:t xml:space="preserve">. </w:t>
+      </w:r>
+      <w:r>
+        <w:t>Visualization &amp; Reporting</w:t>
       </w:r>
     </w:p>
     <w:tbl>
@@ -6707,7 +7259,21 @@
                 <w:sz w:val="20"/>
                 <w:szCs w:val="20"/>
               </w:rPr>
-              <w:t>Dashboard SHALL show: average price by category (bar chart)</w:t>
+              <w:t xml:space="preserve">Dashboard </w:t>
+            </w:r>
+            <w:r>
+              <w:rPr>
+                <w:sz w:val="20"/>
+                <w:szCs w:val="20"/>
+              </w:rPr>
+              <w:t>shall</w:t>
+            </w:r>
+            <w:r>
+              <w:rPr>
+                <w:sz w:val="20"/>
+                <w:szCs w:val="20"/>
+              </w:rPr>
+              <w:t xml:space="preserve"> show: average price by category (bar chart)</w:t>
             </w:r>
           </w:p>
         </w:tc>
@@ -6790,7 +7356,21 @@
                 <w:sz w:val="20"/>
                 <w:szCs w:val="20"/>
               </w:rPr>
-              <w:t>Dashboard SHALL show: top 10 products by rating (table)</w:t>
+              <w:t xml:space="preserve">Dashboard </w:t>
+            </w:r>
+            <w:r>
+              <w:rPr>
+                <w:sz w:val="20"/>
+                <w:szCs w:val="20"/>
+              </w:rPr>
+              <w:t xml:space="preserve">shall </w:t>
+            </w:r>
+            <w:r>
+              <w:rPr>
+                <w:sz w:val="20"/>
+                <w:szCs w:val="20"/>
+              </w:rPr>
+              <w:t>show: top 10 products by rating (table)</w:t>
             </w:r>
           </w:p>
         </w:tc>
@@ -6873,7 +7453,21 @@
                 <w:sz w:val="20"/>
                 <w:szCs w:val="20"/>
               </w:rPr>
-              <w:t>Dashboard SHALL show: daily product count trend (line chart)</w:t>
+              <w:t xml:space="preserve">Dashboard </w:t>
+            </w:r>
+            <w:r>
+              <w:rPr>
+                <w:sz w:val="20"/>
+                <w:szCs w:val="20"/>
+              </w:rPr>
+              <w:t xml:space="preserve">shall </w:t>
+            </w:r>
+            <w:r>
+              <w:rPr>
+                <w:sz w:val="20"/>
+                <w:szCs w:val="20"/>
+              </w:rPr>
+              <w:t>show: daily product count trend (line chart)</w:t>
             </w:r>
           </w:p>
         </w:tc>
@@ -6956,7 +7550,21 @@
                 <w:sz w:val="20"/>
                 <w:szCs w:val="20"/>
               </w:rPr>
-              <w:t>Dashboard SHALL show: pipeline run history (success/failure per day)</w:t>
+              <w:t xml:space="preserve">Dashboard </w:t>
+            </w:r>
+            <w:r>
+              <w:rPr>
+                <w:sz w:val="20"/>
+                <w:szCs w:val="20"/>
+              </w:rPr>
+              <w:t xml:space="preserve">shall </w:t>
+            </w:r>
+            <w:r>
+              <w:rPr>
+                <w:sz w:val="20"/>
+                <w:szCs w:val="20"/>
+              </w:rPr>
+              <w:t>show: pipeline run history (success/failure per day)</w:t>
             </w:r>
           </w:p>
         </w:tc>
@@ -7039,7 +7647,21 @@
                 <w:sz w:val="20"/>
                 <w:szCs w:val="20"/>
               </w:rPr>
-              <w:t>Dashboard SHALL include date range and category filters</w:t>
+              <w:t xml:space="preserve">Dashboard </w:t>
+            </w:r>
+            <w:r>
+              <w:rPr>
+                <w:sz w:val="20"/>
+                <w:szCs w:val="20"/>
+              </w:rPr>
+              <w:t xml:space="preserve">shall </w:t>
+            </w:r>
+            <w:r>
+              <w:rPr>
+                <w:sz w:val="20"/>
+                <w:szCs w:val="20"/>
+              </w:rPr>
+              <w:t>include date range and category filters</w:t>
             </w:r>
           </w:p>
         </w:tc>
@@ -7122,7 +7744,21 @@
                 <w:sz w:val="20"/>
                 <w:szCs w:val="20"/>
               </w:rPr>
-              <w:t>Dashboard SHALL auto-refresh every 24 hours or on demand</w:t>
+              <w:t xml:space="preserve">Dashboard </w:t>
+            </w:r>
+            <w:r>
+              <w:rPr>
+                <w:sz w:val="20"/>
+                <w:szCs w:val="20"/>
+              </w:rPr>
+              <w:t xml:space="preserve">shall </w:t>
+            </w:r>
+            <w:r>
+              <w:rPr>
+                <w:sz w:val="20"/>
+                <w:szCs w:val="20"/>
+              </w:rPr>
+              <w:t>auto-refresh every 24 hours or on demand</w:t>
             </w:r>
           </w:p>
         </w:tc>
@@ -7712,13 +8348,12 @@
             </w:tcMar>
           </w:tcPr>
           <w:p>
-            <w:r>
-              <w:rPr>
-                <w:b/>
-                <w:bCs/>
-                <w:color w:val="FFFFFF"/>
-                <w:sz w:val="26"/>
-                <w:szCs w:val="26"/>
+            <w:pPr>
+              <w:pStyle w:val="Heading1"/>
+            </w:pPr>
+            <w:r>
+              <w:rPr>
+                <w:color w:val="FFFFFF" w:themeColor="background1"/>
               </w:rPr>
               <w:t>SECTION 4: NON-FUNCTIONAL REQUIREMENTS</w:t>
             </w:r>
@@ -8652,13 +9287,12 @@
             </w:tcMar>
           </w:tcPr>
           <w:p>
-            <w:r>
-              <w:rPr>
-                <w:b/>
-                <w:bCs/>
-                <w:color w:val="FFFFFF"/>
-                <w:sz w:val="26"/>
-                <w:szCs w:val="26"/>
+            <w:pPr>
+              <w:pStyle w:val="Heading1"/>
+            </w:pPr>
+            <w:r>
+              <w:rPr>
+                <w:color w:val="FFFFFF" w:themeColor="background1"/>
               </w:rPr>
               <w:t>SECTION 5: SYSTEM ARCHITECTURE</w:t>
             </w:r>
@@ -8680,7 +9314,13 @@
         <w:pStyle w:val="Heading2"/>
       </w:pPr>
       <w:r>
-        <w:t>5.1  High-Level Architecture</w:t>
+        <w:t>5.1</w:t>
+      </w:r>
+      <w:r>
+        <w:t xml:space="preserve">. </w:t>
+      </w:r>
+      <w:r>
+        <w:t>High-Level Architecture</w:t>
       </w:r>
     </w:p>
     <w:p>
@@ -8753,44 +9393,73 @@
             </w:r>
           </w:p>
           <w:p>
-            <w:r>
+            <w:pPr>
               <w:rPr>
                 <w:sz w:val="21"/>
                 <w:szCs w:val="21"/>
               </w:rPr>
-              <w:t>[Data Source (API / Web)] ──► [Extractor (Python/requests)] ──► [Staging (CSV/JSON files)] ──► [Transformer (Pandas)] ──► [Loader (</w:t>
-            </w:r>
-            <w:proofErr w:type="spellStart"/>
+            </w:pPr>
             <w:r>
               <w:rPr>
                 <w:sz w:val="21"/>
                 <w:szCs w:val="21"/>
               </w:rPr>
-              <w:t>SQLAlchemy</w:t>
-            </w:r>
-            <w:proofErr w:type="spellEnd"/>
+              <w:t>[Data Source (API / Web)] ──► [Extractor (Python/requests)] ──► [Staging (CSV/JSON files)] ──► [Transformer (Pandas)] ──► [Loader (</w:t>
+            </w:r>
+            <w:proofErr w:type="spellStart"/>
             <w:r>
               <w:rPr>
                 <w:sz w:val="21"/>
                 <w:szCs w:val="21"/>
               </w:rPr>
-              <w:t>)] ──► [PostgreSQL] ──► [</w:t>
-            </w:r>
-            <w:proofErr w:type="spellStart"/>
+              <w:t>SQLAlchemy</w:t>
+            </w:r>
+            <w:proofErr w:type="spellEnd"/>
             <w:r>
               <w:rPr>
                 <w:sz w:val="21"/>
                 <w:szCs w:val="21"/>
               </w:rPr>
-              <w:t>Metabase</w:t>
-            </w:r>
-            <w:proofErr w:type="spellEnd"/>
+              <w:t>)] ──► [PostgreSQL] ──► [</w:t>
+            </w:r>
+            <w:proofErr w:type="spellStart"/>
             <w:r>
               <w:rPr>
                 <w:sz w:val="21"/>
                 <w:szCs w:val="21"/>
               </w:rPr>
-              <w:t xml:space="preserve"> Dashboard]                              All steps orchestrated and monitored by Apache Airflow</w:t>
+              <w:t>Metabase</w:t>
+            </w:r>
+            <w:proofErr w:type="spellEnd"/>
+            <w:r>
+              <w:rPr>
+                <w:sz w:val="21"/>
+                <w:szCs w:val="21"/>
+              </w:rPr>
+              <w:t xml:space="preserve"> Dashboard]                              </w:t>
+            </w:r>
+          </w:p>
+          <w:p>
+            <w:r>
+              <w:rPr>
+                <w:sz w:val="21"/>
+                <w:szCs w:val="21"/>
+              </w:rPr>
+              <w:t>(</w:t>
+            </w:r>
+            <w:r>
+              <w:rPr>
+                <w:sz w:val="21"/>
+                <w:szCs w:val="21"/>
+              </w:rPr>
+              <w:t>All steps orchestrated and monitored by Apache Airflow</w:t>
+            </w:r>
+            <w:r>
+              <w:rPr>
+                <w:sz w:val="21"/>
+                <w:szCs w:val="21"/>
+              </w:rPr>
+              <w:t>)</w:t>
             </w:r>
           </w:p>
         </w:tc>
@@ -8810,7 +9479,14 @@
         <w:pStyle w:val="Heading2"/>
       </w:pPr>
       <w:r>
-        <w:t>5.2  Component Breakdown</w:t>
+        <w:lastRenderedPageBreak/>
+        <w:t>5.2</w:t>
+      </w:r>
+      <w:r>
+        <w:t xml:space="preserve">. </w:t>
+      </w:r>
+      <w:r>
+        <w:t>Component Breakdown</w:t>
       </w:r>
     </w:p>
     <w:tbl>
@@ -8953,7 +9629,6 @@
                 <w:sz w:val="20"/>
                 <w:szCs w:val="20"/>
               </w:rPr>
-              <w:lastRenderedPageBreak/>
               <w:t>Extractor</w:t>
             </w:r>
           </w:p>
@@ -9634,7 +10309,13 @@
         <w:pStyle w:val="Heading2"/>
       </w:pPr>
       <w:r>
-        <w:t>5.3  Database Schema</w:t>
+        <w:t>5.3</w:t>
+      </w:r>
+      <w:r>
+        <w:t xml:space="preserve">. </w:t>
+      </w:r>
+      <w:r>
+        <w:t>Database Schema</w:t>
       </w:r>
     </w:p>
     <w:p>
@@ -11394,6 +12075,7 @@
         <w:pStyle w:val="Heading3"/>
       </w:pPr>
       <w:r>
+        <w:lastRenderedPageBreak/>
         <w:t xml:space="preserve">Table: </w:t>
       </w:r>
       <w:proofErr w:type="spellStart"/>
@@ -11543,7 +12225,6 @@
                 <w:sz w:val="20"/>
                 <w:szCs w:val="20"/>
               </w:rPr>
-              <w:lastRenderedPageBreak/>
               <w:t>run_id</w:t>
             </w:r>
             <w:proofErr w:type="spellEnd"/>
@@ -13166,15 +13847,14 @@
             </w:tcMar>
           </w:tcPr>
           <w:p>
-            <w:r>
-              <w:rPr>
-                <w:b/>
-                <w:bCs/>
-                <w:color w:val="FFFFFF"/>
-                <w:sz w:val="26"/>
-                <w:szCs w:val="26"/>
-              </w:rPr>
-              <w:t>SECTION 6: RECOMMENDED PROJECT STRUCTURE</w:t>
+            <w:pPr>
+              <w:pStyle w:val="Heading1"/>
+            </w:pPr>
+            <w:r>
+              <w:rPr>
+                <w:color w:val="FFFFFF" w:themeColor="background1"/>
+              </w:rPr>
+              <w:t>SECTION 6: PROJECT STRUCTURE</w:t>
             </w:r>
           </w:p>
         </w:tc>
@@ -13452,6 +14132,7 @@
                 <w:sz w:val="21"/>
                 <w:szCs w:val="21"/>
               </w:rPr>
+              <w:lastRenderedPageBreak/>
               <w:t>├── tests/</w:t>
             </w:r>
           </w:p>
@@ -13543,7 +14224,6 @@
                 <w:sz w:val="21"/>
                 <w:szCs w:val="21"/>
               </w:rPr>
-              <w:lastRenderedPageBreak/>
               <w:t xml:space="preserve">│   ├── </w:t>
             </w:r>
             <w:proofErr w:type="spellStart"/>
@@ -13824,13 +14504,12 @@
             </w:tcMar>
           </w:tcPr>
           <w:p>
-            <w:r>
-              <w:rPr>
-                <w:b/>
-                <w:bCs/>
-                <w:color w:val="FFFFFF"/>
-                <w:sz w:val="26"/>
-                <w:szCs w:val="26"/>
+            <w:pPr>
+              <w:pStyle w:val="Heading1"/>
+            </w:pPr>
+            <w:r>
+              <w:rPr>
+                <w:color w:val="FFFFFF" w:themeColor="background1"/>
               </w:rPr>
               <w:t>SECTION 7: IMPLEMENTATION MILESTONES &amp; RISKS</w:t>
             </w:r>
@@ -13852,7 +14531,13 @@
         <w:pStyle w:val="Heading2"/>
       </w:pPr>
       <w:r>
-        <w:t>7.1  Suggested Implementation Phases</w:t>
+        <w:t>7.1</w:t>
+      </w:r>
+      <w:r>
+        <w:t xml:space="preserve">. </w:t>
+      </w:r>
+      <w:r>
+        <w:t>Implementation Phases</w:t>
       </w:r>
     </w:p>
     <w:tbl>
@@ -14847,7 +15532,13 @@
         <w:pStyle w:val="Heading2"/>
       </w:pPr>
       <w:r>
-        <w:t>7.2  Risk Register</w:t>
+        <w:t>7.2</w:t>
+      </w:r>
+      <w:r>
+        <w:t xml:space="preserve">. </w:t>
+      </w:r>
+      <w:r>
+        <w:t>Risk Register</w:t>
       </w:r>
     </w:p>
     <w:tbl>
@@ -15361,7 +16052,6 @@
                 <w:sz w:val="20"/>
                 <w:szCs w:val="20"/>
               </w:rPr>
-              <w:lastRenderedPageBreak/>
               <w:t>Airflow scheduler crashing silently (no alert)</w:t>
             </w:r>
           </w:p>
@@ -15858,13 +16548,12 @@
             </w:tcMar>
           </w:tcPr>
           <w:p>
-            <w:r>
-              <w:rPr>
-                <w:b/>
-                <w:bCs/>
-                <w:color w:val="FFFFFF"/>
-                <w:sz w:val="26"/>
-                <w:szCs w:val="26"/>
+            <w:pPr>
+              <w:pStyle w:val="Heading1"/>
+            </w:pPr>
+            <w:r>
+              <w:rPr>
+                <w:color w:val="FFFFFF" w:themeColor="background1"/>
               </w:rPr>
               <w:t>SECTION 8: TECHNICAL RECOMMENDATIONS</w:t>
             </w:r>
@@ -15886,7 +16575,13 @@
         <w:pStyle w:val="Heading2"/>
       </w:pPr>
       <w:r>
-        <w:t>8.1  Key Technical Decisions &amp; Rationale</w:t>
+        <w:t>8.1</w:t>
+      </w:r>
+      <w:r>
+        <w:t xml:space="preserve">. </w:t>
+      </w:r>
+      <w:r>
+        <w:t>Key Technical Decisions &amp; Rationale</w:t>
       </w:r>
     </w:p>
     <w:tbl>
@@ -16735,7 +17430,13 @@
         <w:pStyle w:val="Heading2"/>
       </w:pPr>
       <w:r>
-        <w:t>8.2  Python Libraries to Include</w:t>
+        <w:t>8.2</w:t>
+      </w:r>
+      <w:r>
+        <w:t xml:space="preserve">. </w:t>
+      </w:r>
+      <w:r>
+        <w:t>Python Libraries to Include</w:t>
       </w:r>
     </w:p>
     <w:tbl>
@@ -16879,6 +17580,7 @@
                 <w:sz w:val="20"/>
                 <w:szCs w:val="20"/>
               </w:rPr>
+              <w:lastRenderedPageBreak/>
               <w:t>apache</w:t>
             </w:r>
             <w:proofErr w:type="spellEnd"/>
@@ -17389,7 +18091,6 @@
                 <w:sz w:val="20"/>
                 <w:szCs w:val="20"/>
               </w:rPr>
-              <w:lastRenderedPageBreak/>
               <w:t>beautifulsoup4</w:t>
             </w:r>
           </w:p>
@@ -17935,15 +18636,16 @@
         <w:pStyle w:val="Heading2"/>
       </w:pPr>
       <w:r>
-        <w:t>8.3  Bonus Point Opportunities</w:t>
+        <w:t>8.3</w:t>
       </w:r>
-    </w:p>
-    <w:p>
-      <w:pPr>
-        <w:spacing w:before="80" w:after="80"/>
-      </w:pPr>
       <w:r>
-        <w:t>The following implementations will significantly differentiate this project:</w:t>
+        <w:t xml:space="preserve">. </w:t>
+      </w:r>
+      <w:r>
+        <w:t>Bonus Poi</w:t>
+      </w:r>
+      <w:r>
+        <w:t>nts</w:t>
       </w:r>
     </w:p>
     <w:p>
@@ -17972,7 +18674,7 @@
               <w:rFonts w:ascii="Arial Unicode MS" w:eastAsia="Arial Unicode MS" w:hAnsi="Arial Unicode MS" w:cs="Arial Unicode MS"/>
               <w:color w:val="000000"/>
             </w:rPr>
-            <w:t>✅ Idempotent UPSERT — same DAG run twice = same DB state (no duplicates)</w:t>
+            <w:t>Idempotent UPSERT — same DAG run twice = same DB state (no duplicates)</w:t>
           </w:r>
         </w:sdtContent>
       </w:sdt>
@@ -18003,7 +18705,7 @@
               <w:rFonts w:ascii="Arial Unicode MS" w:eastAsia="Arial Unicode MS" w:hAnsi="Arial Unicode MS" w:cs="Arial Unicode MS"/>
               <w:color w:val="000000"/>
             </w:rPr>
-            <w:t>✅ Exponential backoff retry — 3 retries with 30s, 60s, 120s delays</w:t>
+            <w:t>Exponential backoff retry — 3 retries with 30s, 60s, 120s delays</w:t>
           </w:r>
         </w:sdtContent>
       </w:sdt>
@@ -18034,7 +18736,7 @@
               <w:rFonts w:ascii="Arial Unicode MS" w:eastAsia="Arial Unicode MS" w:hAnsi="Arial Unicode MS" w:cs="Arial Unicode MS"/>
               <w:color w:val="000000"/>
             </w:rPr>
-            <w:t>✅ Data quality score — per-run metric: % rows passing all validation checks</w:t>
+            <w:t>Data quality score — per-run metric: % rows passing all validation checks</w:t>
           </w:r>
         </w:sdtContent>
       </w:sdt>
@@ -18065,7 +18767,7 @@
               <w:rFonts w:ascii="Arial Unicode MS" w:eastAsia="Arial Unicode MS" w:hAnsi="Arial Unicode MS" w:cs="Arial Unicode MS"/>
               <w:color w:val="000000"/>
             </w:rPr>
-            <w:t>✅ Rejected records audit table — every dropped row is traceable with a reason</w:t>
+            <w:t>Rejected records audit table — every dropped row is traceable with a reason</w:t>
           </w:r>
         </w:sdtContent>
       </w:sdt>
@@ -18096,7 +18798,7 @@
               <w:rFonts w:ascii="Arial Unicode MS" w:eastAsia="Arial Unicode MS" w:hAnsi="Arial Unicode MS" w:cs="Arial Unicode MS"/>
               <w:color w:val="000000"/>
             </w:rPr>
-            <w:t>✅ Schema drift detection — alert if source adds/removes columns unexpectedly</w:t>
+            <w:t>Schema drift detection — alert if source adds/removes columns unexpectedly</w:t>
           </w:r>
         </w:sdtContent>
       </w:sdt>
@@ -18127,7 +18829,7 @@
               <w:rFonts w:ascii="Arial Unicode MS" w:eastAsia="Arial Unicode MS" w:hAnsi="Arial Unicode MS" w:cs="Arial Unicode MS"/>
               <w:color w:val="000000"/>
             </w:rPr>
-            <w:t>✅ Backfill capability — reprocess historical dates with catchup=True</w:t>
+            <w:t>Backfill capability — reprocess historical dates with catchup=True</w:t>
           </w:r>
         </w:sdtContent>
       </w:sdt>
@@ -18158,7 +18860,7 @@
               <w:rFonts w:ascii="Arial Unicode MS" w:eastAsia="Arial Unicode MS" w:hAnsi="Arial Unicode MS" w:cs="Arial Unicode MS"/>
               <w:color w:val="000000"/>
             </w:rPr>
-            <w:t>✅ Unit tests with mocked HTTP responses — no live API needed for CI/CD</w:t>
+            <w:t>Unit tests with mocked HTTP responses — no live API needed for CI/CD</w:t>
           </w:r>
         </w:sdtContent>
       </w:sdt>
@@ -18184,13 +18886,6 @@
           <w:id w:val="2138665019"/>
         </w:sdtPr>
         <w:sdtContent>
-          <w:r>
-            <w:rPr>
-              <w:rFonts w:ascii="Arial Unicode MS" w:eastAsia="Arial Unicode MS" w:hAnsi="Arial Unicode MS" w:cs="Arial Unicode MS"/>
-              <w:color w:val="000000"/>
-            </w:rPr>
-            <w:t xml:space="preserve">✅ </w:t>
-          </w:r>
           <w:proofErr w:type="spellStart"/>
           <w:r>
             <w:rPr>
@@ -18257,13 +18952,12 @@
             </w:tcMar>
           </w:tcPr>
           <w:p>
-            <w:r>
-              <w:rPr>
-                <w:b/>
-                <w:bCs/>
-                <w:color w:val="FFFFFF"/>
-                <w:sz w:val="26"/>
-                <w:szCs w:val="26"/>
+            <w:pPr>
+              <w:pStyle w:val="Heading1"/>
+            </w:pPr>
+            <w:r>
+              <w:rPr>
+                <w:color w:val="FFFFFF" w:themeColor="background1"/>
               </w:rPr>
               <w:t>SECTION 9: ACCEPTANCE CRITERIA</w:t>
             </w:r>
@@ -18285,7 +18979,13 @@
         <w:spacing w:before="80" w:after="80"/>
       </w:pPr>
       <w:r>
-        <w:t>The project is considered complete and production-ready when ALL of the following criteria are met:</w:t>
+        <w:t xml:space="preserve">The project is considered complete and production-ready when </w:t>
+      </w:r>
+      <w:r>
+        <w:t>all</w:t>
+      </w:r>
+      <w:r>
+        <w:t xml:space="preserve"> of the following criteria are met:</w:t>
       </w:r>
     </w:p>
     <w:p>
@@ -18796,6 +19496,7 @@
                 <w:sz w:val="20"/>
                 <w:szCs w:val="20"/>
               </w:rPr>
+              <w:lastRenderedPageBreak/>
               <w:t>Dashboard loads correctly</w:t>
             </w:r>
           </w:p>
@@ -19489,13 +20190,12 @@
             </w:tcMar>
           </w:tcPr>
           <w:p>
-            <w:r>
-              <w:rPr>
-                <w:b/>
-                <w:bCs/>
-                <w:color w:val="FFFFFF"/>
-                <w:sz w:val="26"/>
-                <w:szCs w:val="26"/>
+            <w:pPr>
+              <w:pStyle w:val="Heading1"/>
+            </w:pPr>
+            <w:r>
+              <w:rPr>
+                <w:color w:val="FFFFFF" w:themeColor="background1"/>
               </w:rPr>
               <w:t>APPENDIX: GLOSSARY &amp; REFERENCES</w:t>
             </w:r>
@@ -20067,6 +20767,7 @@
         <w:pStyle w:val="Heading2"/>
       </w:pPr>
       <w:r>
+        <w:lastRenderedPageBreak/>
         <w:t>Reference Links</w:t>
       </w:r>
     </w:p>
@@ -20362,6 +21063,458 @@
 <file path=word/numbering.xml><?xml version="1.0" encoding="utf-8"?>
 <w:numbering xmlns:wpc="http://schemas.microsoft.com/office/word/2010/wordprocessingCanvas" xmlns:cx="http://schemas.microsoft.com/office/drawing/2014/chartex" xmlns:cx1="http://schemas.microsoft.com/office/drawing/2015/9/8/chartex" xmlns:cx2="http://schemas.microsoft.com/office/drawing/2015/10/21/chartex" xmlns:cx3="http://schemas.microsoft.com/office/drawing/2016/5/9/chartex" xmlns:cx4="http://schemas.microsoft.com/office/drawing/2016/5/10/chartex" xmlns:cx5="http://schemas.microsoft.com/office/drawing/2016/5/11/chartex" xmlns:cx6="http://schemas.microsoft.com/office/drawing/2016/5/12/chartex" xmlns:cx7="http://schemas.microsoft.com/office/drawing/2016/5/13/chartex" xmlns:cx8="http://schemas.microsoft.com/office/drawing/2016/5/14/chartex" xmlns:mc="http://schemas.openxmlformats.org/markup-compatibility/2006" xmlns:aink="http://schemas.microsoft.com/office/drawing/2016/ink" xmlns:am3d="http://schemas.microsoft.com/office/drawing/2017/model3d" xmlns:o="urn:schemas-microsoft-com:office:office" xmlns:oel="http://schemas.microsoft.com/office/2019/extlst" xmlns:r="http://schemas.openxmlformats.org/officeDocument/2006/relationships" xmlns:m="http://schemas.openxmlformats.org/officeDocument/2006/math" xmlns:v="urn:schemas-microsoft-com:vml" xmlns:wp14="http://schemas.microsoft.com/office/word/2010/wordprocessingDrawing" xmlns:wp="http://schemas.openxmlformats.org/drawingml/2006/wordprocessingDrawing" xmlns:w10="urn:schemas-microsoft-com:office:word" xmlns:w="http://schemas.openxmlformats.org/wordprocessingml/2006/main" xmlns:w14="http://schemas.microsoft.com/office/word/2010/wordml" xmlns:w15="http://schemas.microsoft.com/office/word/2012/wordml" xmlns:w16cex="http://schemas.microsoft.com/office/word/2018/wordml/cex" xmlns:w16cid="http://schemas.microsoft.com/office/word/2016/wordml/cid" xmlns:w16="http://schemas.microsoft.com/office/word/2018/wordml" xmlns:w16du="http://schemas.microsoft.com/office/word/2023/wordml/word16du" xmlns:w16sdtdh="http://schemas.microsoft.com/office/word/2020/wordml/sdtdatahash" xmlns:w16sdtfl="http://schemas.microsoft.com/office/word/2024/wordml/sdtformatlock" xmlns:w16se="http://schemas.microsoft.com/office/word/2015/wordml/symex" xmlns:wpg="http://schemas.microsoft.com/office/word/2010/wordprocessingGroup" xmlns:wpi="http://schemas.microsoft.com/office/word/2010/wordprocessingInk" xmlns:wne="http://schemas.microsoft.com/office/word/2006/wordml" xmlns:wps="http://schemas.microsoft.com/office/word/2010/wordprocessingShape" mc:Ignorable="w14 w15 w16se w16cid w16 w16cex w16sdtdh w16sdtfl w16du wp14">
   <w:abstractNum w:abstractNumId="0" w15:restartNumberingAfterBreak="0">
+    <w:nsid w:val="08D21B97"/>
+    <w:multiLevelType w:val="hybridMultilevel"/>
+    <w:tmpl w:val="6A6888C2"/>
+    <w:lvl w:ilvl="0" w:tplc="04090001">
+      <w:start w:val="1"/>
+      <w:numFmt w:val="bullet"/>
+      <w:lvlText w:val=""/>
+      <w:lvlJc w:val="left"/>
+      <w:pPr>
+        <w:ind w:left="1080" w:hanging="360"/>
+      </w:pPr>
+      <w:rPr>
+        <w:rFonts w:ascii="Symbol" w:hAnsi="Symbol" w:hint="default"/>
+      </w:rPr>
+    </w:lvl>
+    <w:lvl w:ilvl="1" w:tplc="04090003" w:tentative="1">
+      <w:start w:val="1"/>
+      <w:numFmt w:val="bullet"/>
+      <w:lvlText w:val="o"/>
+      <w:lvlJc w:val="left"/>
+      <w:pPr>
+        <w:ind w:left="1800" w:hanging="360"/>
+      </w:pPr>
+      <w:rPr>
+        <w:rFonts w:ascii="Courier New" w:hAnsi="Courier New" w:cs="Courier New" w:hint="default"/>
+      </w:rPr>
+    </w:lvl>
+    <w:lvl w:ilvl="2" w:tplc="04090005" w:tentative="1">
+      <w:start w:val="1"/>
+      <w:numFmt w:val="bullet"/>
+      <w:lvlText w:val=""/>
+      <w:lvlJc w:val="left"/>
+      <w:pPr>
+        <w:ind w:left="2520" w:hanging="360"/>
+      </w:pPr>
+      <w:rPr>
+        <w:rFonts w:ascii="Wingdings" w:hAnsi="Wingdings" w:hint="default"/>
+      </w:rPr>
+    </w:lvl>
+    <w:lvl w:ilvl="3" w:tplc="04090001" w:tentative="1">
+      <w:start w:val="1"/>
+      <w:numFmt w:val="bullet"/>
+      <w:lvlText w:val=""/>
+      <w:lvlJc w:val="left"/>
+      <w:pPr>
+        <w:ind w:left="3240" w:hanging="360"/>
+      </w:pPr>
+      <w:rPr>
+        <w:rFonts w:ascii="Symbol" w:hAnsi="Symbol" w:hint="default"/>
+      </w:rPr>
+    </w:lvl>
+    <w:lvl w:ilvl="4" w:tplc="04090003" w:tentative="1">
+      <w:start w:val="1"/>
+      <w:numFmt w:val="bullet"/>
+      <w:lvlText w:val="o"/>
+      <w:lvlJc w:val="left"/>
+      <w:pPr>
+        <w:ind w:left="3960" w:hanging="360"/>
+      </w:pPr>
+      <w:rPr>
+        <w:rFonts w:ascii="Courier New" w:hAnsi="Courier New" w:cs="Courier New" w:hint="default"/>
+      </w:rPr>
+    </w:lvl>
+    <w:lvl w:ilvl="5" w:tplc="04090005" w:tentative="1">
+      <w:start w:val="1"/>
+      <w:numFmt w:val="bullet"/>
+      <w:lvlText w:val=""/>
+      <w:lvlJc w:val="left"/>
+      <w:pPr>
+        <w:ind w:left="4680" w:hanging="360"/>
+      </w:pPr>
+      <w:rPr>
+        <w:rFonts w:ascii="Wingdings" w:hAnsi="Wingdings" w:hint="default"/>
+      </w:rPr>
+    </w:lvl>
+    <w:lvl w:ilvl="6" w:tplc="04090001" w:tentative="1">
+      <w:start w:val="1"/>
+      <w:numFmt w:val="bullet"/>
+      <w:lvlText w:val=""/>
+      <w:lvlJc w:val="left"/>
+      <w:pPr>
+        <w:ind w:left="5400" w:hanging="360"/>
+      </w:pPr>
+      <w:rPr>
+        <w:rFonts w:ascii="Symbol" w:hAnsi="Symbol" w:hint="default"/>
+      </w:rPr>
+    </w:lvl>
+    <w:lvl w:ilvl="7" w:tplc="04090003" w:tentative="1">
+      <w:start w:val="1"/>
+      <w:numFmt w:val="bullet"/>
+      <w:lvlText w:val="o"/>
+      <w:lvlJc w:val="left"/>
+      <w:pPr>
+        <w:ind w:left="6120" w:hanging="360"/>
+      </w:pPr>
+      <w:rPr>
+        <w:rFonts w:ascii="Courier New" w:hAnsi="Courier New" w:cs="Courier New" w:hint="default"/>
+      </w:rPr>
+    </w:lvl>
+    <w:lvl w:ilvl="8" w:tplc="04090005" w:tentative="1">
+      <w:start w:val="1"/>
+      <w:numFmt w:val="bullet"/>
+      <w:lvlText w:val=""/>
+      <w:lvlJc w:val="left"/>
+      <w:pPr>
+        <w:ind w:left="6840" w:hanging="360"/>
+      </w:pPr>
+      <w:rPr>
+        <w:rFonts w:ascii="Wingdings" w:hAnsi="Wingdings" w:hint="default"/>
+      </w:rPr>
+    </w:lvl>
+  </w:abstractNum>
+  <w:abstractNum w:abstractNumId="1" w15:restartNumberingAfterBreak="0">
+    <w:nsid w:val="11D14518"/>
+    <w:multiLevelType w:val="hybridMultilevel"/>
+    <w:tmpl w:val="DAAA5EA4"/>
+    <w:lvl w:ilvl="0" w:tplc="04090001">
+      <w:start w:val="1"/>
+      <w:numFmt w:val="bullet"/>
+      <w:lvlText w:val=""/>
+      <w:lvlJc w:val="left"/>
+      <w:pPr>
+        <w:ind w:left="1080" w:hanging="360"/>
+      </w:pPr>
+      <w:rPr>
+        <w:rFonts w:ascii="Symbol" w:hAnsi="Symbol" w:hint="default"/>
+      </w:rPr>
+    </w:lvl>
+    <w:lvl w:ilvl="1" w:tplc="04090003" w:tentative="1">
+      <w:start w:val="1"/>
+      <w:numFmt w:val="bullet"/>
+      <w:lvlText w:val="o"/>
+      <w:lvlJc w:val="left"/>
+      <w:pPr>
+        <w:ind w:left="1800" w:hanging="360"/>
+      </w:pPr>
+      <w:rPr>
+        <w:rFonts w:ascii="Courier New" w:hAnsi="Courier New" w:cs="Courier New" w:hint="default"/>
+      </w:rPr>
+    </w:lvl>
+    <w:lvl w:ilvl="2" w:tplc="04090005" w:tentative="1">
+      <w:start w:val="1"/>
+      <w:numFmt w:val="bullet"/>
+      <w:lvlText w:val=""/>
+      <w:lvlJc w:val="left"/>
+      <w:pPr>
+        <w:ind w:left="2520" w:hanging="360"/>
+      </w:pPr>
+      <w:rPr>
+        <w:rFonts w:ascii="Wingdings" w:hAnsi="Wingdings" w:hint="default"/>
+      </w:rPr>
+    </w:lvl>
+    <w:lvl w:ilvl="3" w:tplc="04090001" w:tentative="1">
+      <w:start w:val="1"/>
+      <w:numFmt w:val="bullet"/>
+      <w:lvlText w:val=""/>
+      <w:lvlJc w:val="left"/>
+      <w:pPr>
+        <w:ind w:left="3240" w:hanging="360"/>
+      </w:pPr>
+      <w:rPr>
+        <w:rFonts w:ascii="Symbol" w:hAnsi="Symbol" w:hint="default"/>
+      </w:rPr>
+    </w:lvl>
+    <w:lvl w:ilvl="4" w:tplc="04090003" w:tentative="1">
+      <w:start w:val="1"/>
+      <w:numFmt w:val="bullet"/>
+      <w:lvlText w:val="o"/>
+      <w:lvlJc w:val="left"/>
+      <w:pPr>
+        <w:ind w:left="3960" w:hanging="360"/>
+      </w:pPr>
+      <w:rPr>
+        <w:rFonts w:ascii="Courier New" w:hAnsi="Courier New" w:cs="Courier New" w:hint="default"/>
+      </w:rPr>
+    </w:lvl>
+    <w:lvl w:ilvl="5" w:tplc="04090005" w:tentative="1">
+      <w:start w:val="1"/>
+      <w:numFmt w:val="bullet"/>
+      <w:lvlText w:val=""/>
+      <w:lvlJc w:val="left"/>
+      <w:pPr>
+        <w:ind w:left="4680" w:hanging="360"/>
+      </w:pPr>
+      <w:rPr>
+        <w:rFonts w:ascii="Wingdings" w:hAnsi="Wingdings" w:hint="default"/>
+      </w:rPr>
+    </w:lvl>
+    <w:lvl w:ilvl="6" w:tplc="04090001" w:tentative="1">
+      <w:start w:val="1"/>
+      <w:numFmt w:val="bullet"/>
+      <w:lvlText w:val=""/>
+      <w:lvlJc w:val="left"/>
+      <w:pPr>
+        <w:ind w:left="5400" w:hanging="360"/>
+      </w:pPr>
+      <w:rPr>
+        <w:rFonts w:ascii="Symbol" w:hAnsi="Symbol" w:hint="default"/>
+      </w:rPr>
+    </w:lvl>
+    <w:lvl w:ilvl="7" w:tplc="04090003" w:tentative="1">
+      <w:start w:val="1"/>
+      <w:numFmt w:val="bullet"/>
+      <w:lvlText w:val="o"/>
+      <w:lvlJc w:val="left"/>
+      <w:pPr>
+        <w:ind w:left="6120" w:hanging="360"/>
+      </w:pPr>
+      <w:rPr>
+        <w:rFonts w:ascii="Courier New" w:hAnsi="Courier New" w:cs="Courier New" w:hint="default"/>
+      </w:rPr>
+    </w:lvl>
+    <w:lvl w:ilvl="8" w:tplc="04090005" w:tentative="1">
+      <w:start w:val="1"/>
+      <w:numFmt w:val="bullet"/>
+      <w:lvlText w:val=""/>
+      <w:lvlJc w:val="left"/>
+      <w:pPr>
+        <w:ind w:left="6840" w:hanging="360"/>
+      </w:pPr>
+      <w:rPr>
+        <w:rFonts w:ascii="Wingdings" w:hAnsi="Wingdings" w:hint="default"/>
+      </w:rPr>
+    </w:lvl>
+  </w:abstractNum>
+  <w:abstractNum w:abstractNumId="2" w15:restartNumberingAfterBreak="0">
+    <w:nsid w:val="3E505079"/>
+    <w:multiLevelType w:val="hybridMultilevel"/>
+    <w:tmpl w:val="98543486"/>
+    <w:lvl w:ilvl="0" w:tplc="50E4D52C">
+      <w:start w:val="1"/>
+      <w:numFmt w:val="bullet"/>
+      <w:lvlText w:val="-"/>
+      <w:lvlJc w:val="left"/>
+      <w:pPr>
+        <w:ind w:left="720" w:hanging="360"/>
+      </w:pPr>
+      <w:rPr>
+        <w:rFonts w:ascii="Arial" w:eastAsia="Arial" w:hAnsi="Arial" w:cs="Arial" w:hint="default"/>
+      </w:rPr>
+    </w:lvl>
+    <w:lvl w:ilvl="1" w:tplc="04090003" w:tentative="1">
+      <w:start w:val="1"/>
+      <w:numFmt w:val="bullet"/>
+      <w:lvlText w:val="o"/>
+      <w:lvlJc w:val="left"/>
+      <w:pPr>
+        <w:ind w:left="1440" w:hanging="360"/>
+      </w:pPr>
+      <w:rPr>
+        <w:rFonts w:ascii="Courier New" w:hAnsi="Courier New" w:cs="Courier New" w:hint="default"/>
+      </w:rPr>
+    </w:lvl>
+    <w:lvl w:ilvl="2" w:tplc="04090005" w:tentative="1">
+      <w:start w:val="1"/>
+      <w:numFmt w:val="bullet"/>
+      <w:lvlText w:val=""/>
+      <w:lvlJc w:val="left"/>
+      <w:pPr>
+        <w:ind w:left="2160" w:hanging="360"/>
+      </w:pPr>
+      <w:rPr>
+        <w:rFonts w:ascii="Wingdings" w:hAnsi="Wingdings" w:hint="default"/>
+      </w:rPr>
+    </w:lvl>
+    <w:lvl w:ilvl="3" w:tplc="04090001" w:tentative="1">
+      <w:start w:val="1"/>
+      <w:numFmt w:val="bullet"/>
+      <w:lvlText w:val=""/>
+      <w:lvlJc w:val="left"/>
+      <w:pPr>
+        <w:ind w:left="2880" w:hanging="360"/>
+      </w:pPr>
+      <w:rPr>
+        <w:rFonts w:ascii="Symbol" w:hAnsi="Symbol" w:hint="default"/>
+      </w:rPr>
+    </w:lvl>
+    <w:lvl w:ilvl="4" w:tplc="04090003" w:tentative="1">
+      <w:start w:val="1"/>
+      <w:numFmt w:val="bullet"/>
+      <w:lvlText w:val="o"/>
+      <w:lvlJc w:val="left"/>
+      <w:pPr>
+        <w:ind w:left="3600" w:hanging="360"/>
+      </w:pPr>
+      <w:rPr>
+        <w:rFonts w:ascii="Courier New" w:hAnsi="Courier New" w:cs="Courier New" w:hint="default"/>
+      </w:rPr>
+    </w:lvl>
+    <w:lvl w:ilvl="5" w:tplc="04090005" w:tentative="1">
+      <w:start w:val="1"/>
+      <w:numFmt w:val="bullet"/>
+      <w:lvlText w:val=""/>
+      <w:lvlJc w:val="left"/>
+      <w:pPr>
+        <w:ind w:left="4320" w:hanging="360"/>
+      </w:pPr>
+      <w:rPr>
+        <w:rFonts w:ascii="Wingdings" w:hAnsi="Wingdings" w:hint="default"/>
+      </w:rPr>
+    </w:lvl>
+    <w:lvl w:ilvl="6" w:tplc="04090001" w:tentative="1">
+      <w:start w:val="1"/>
+      <w:numFmt w:val="bullet"/>
+      <w:lvlText w:val=""/>
+      <w:lvlJc w:val="left"/>
+      <w:pPr>
+        <w:ind w:left="5040" w:hanging="360"/>
+      </w:pPr>
+      <w:rPr>
+        <w:rFonts w:ascii="Symbol" w:hAnsi="Symbol" w:hint="default"/>
+      </w:rPr>
+    </w:lvl>
+    <w:lvl w:ilvl="7" w:tplc="04090003" w:tentative="1">
+      <w:start w:val="1"/>
+      <w:numFmt w:val="bullet"/>
+      <w:lvlText w:val="o"/>
+      <w:lvlJc w:val="left"/>
+      <w:pPr>
+        <w:ind w:left="5760" w:hanging="360"/>
+      </w:pPr>
+      <w:rPr>
+        <w:rFonts w:ascii="Courier New" w:hAnsi="Courier New" w:cs="Courier New" w:hint="default"/>
+      </w:rPr>
+    </w:lvl>
+    <w:lvl w:ilvl="8" w:tplc="04090005" w:tentative="1">
+      <w:start w:val="1"/>
+      <w:numFmt w:val="bullet"/>
+      <w:lvlText w:val=""/>
+      <w:lvlJc w:val="left"/>
+      <w:pPr>
+        <w:ind w:left="6480" w:hanging="360"/>
+      </w:pPr>
+      <w:rPr>
+        <w:rFonts w:ascii="Wingdings" w:hAnsi="Wingdings" w:hint="default"/>
+      </w:rPr>
+    </w:lvl>
+  </w:abstractNum>
+  <w:abstractNum w:abstractNumId="3" w15:restartNumberingAfterBreak="0">
+    <w:nsid w:val="618902EE"/>
+    <w:multiLevelType w:val="multilevel"/>
+    <w:tmpl w:val="08EA73B8"/>
+    <w:lvl w:ilvl="0">
+      <w:start w:val="1"/>
+      <w:numFmt w:val="decimal"/>
+      <w:lvlText w:val="%1."/>
+      <w:lvlJc w:val="left"/>
+      <w:pPr>
+        <w:ind w:left="432" w:hanging="432"/>
+      </w:pPr>
+      <w:rPr>
+        <w:rFonts w:hint="default"/>
+      </w:rPr>
+    </w:lvl>
+    <w:lvl w:ilvl="1">
+      <w:start w:val="1"/>
+      <w:numFmt w:val="decimal"/>
+      <w:lvlText w:val="%1.%2."/>
+      <w:lvlJc w:val="left"/>
+      <w:pPr>
+        <w:ind w:left="720" w:hanging="720"/>
+      </w:pPr>
+      <w:rPr>
+        <w:rFonts w:hint="default"/>
+      </w:rPr>
+    </w:lvl>
+    <w:lvl w:ilvl="2">
+      <w:start w:val="1"/>
+      <w:numFmt w:val="decimal"/>
+      <w:lvlText w:val="%1.%2.%3."/>
+      <w:lvlJc w:val="left"/>
+      <w:pPr>
+        <w:ind w:left="720" w:hanging="720"/>
+      </w:pPr>
+      <w:rPr>
+        <w:rFonts w:hint="default"/>
+      </w:rPr>
+    </w:lvl>
+    <w:lvl w:ilvl="3">
+      <w:start w:val="1"/>
+      <w:numFmt w:val="decimal"/>
+      <w:lvlText w:val="%1.%2.%3.%4."/>
+      <w:lvlJc w:val="left"/>
+      <w:pPr>
+        <w:ind w:left="1080" w:hanging="1080"/>
+      </w:pPr>
+      <w:rPr>
+        <w:rFonts w:hint="default"/>
+      </w:rPr>
+    </w:lvl>
+    <w:lvl w:ilvl="4">
+      <w:start w:val="1"/>
+      <w:numFmt w:val="decimal"/>
+      <w:lvlText w:val="%1.%2.%3.%4.%5."/>
+      <w:lvlJc w:val="left"/>
+      <w:pPr>
+        <w:ind w:left="1440" w:hanging="1440"/>
+      </w:pPr>
+      <w:rPr>
+        <w:rFonts w:hint="default"/>
+      </w:rPr>
+    </w:lvl>
+    <w:lvl w:ilvl="5">
+      <w:start w:val="1"/>
+      <w:numFmt w:val="decimal"/>
+      <w:lvlText w:val="%1.%2.%3.%4.%5.%6."/>
+      <w:lvlJc w:val="left"/>
+      <w:pPr>
+        <w:ind w:left="1440" w:hanging="1440"/>
+      </w:pPr>
+      <w:rPr>
+        <w:rFonts w:hint="default"/>
+      </w:rPr>
+    </w:lvl>
+    <w:lvl w:ilvl="6">
+      <w:start w:val="1"/>
+      <w:numFmt w:val="decimal"/>
+      <w:lvlText w:val="%1.%2.%3.%4.%5.%6.%7."/>
+      <w:lvlJc w:val="left"/>
+      <w:pPr>
+        <w:ind w:left="1800" w:hanging="1800"/>
+      </w:pPr>
+      <w:rPr>
+        <w:rFonts w:hint="default"/>
+      </w:rPr>
+    </w:lvl>
+    <w:lvl w:ilvl="7">
+      <w:start w:val="1"/>
+      <w:numFmt w:val="decimal"/>
+      <w:lvlText w:val="%1.%2.%3.%4.%5.%6.%7.%8."/>
+      <w:lvlJc w:val="left"/>
+      <w:pPr>
+        <w:ind w:left="1800" w:hanging="1800"/>
+      </w:pPr>
+      <w:rPr>
+        <w:rFonts w:hint="default"/>
+      </w:rPr>
+    </w:lvl>
+    <w:lvl w:ilvl="8">
+      <w:start w:val="1"/>
+      <w:numFmt w:val="decimal"/>
+      <w:lvlText w:val="%1.%2.%3.%4.%5.%6.%7.%8.%9."/>
+      <w:lvlJc w:val="left"/>
+      <w:pPr>
+        <w:ind w:left="2160" w:hanging="2160"/>
+      </w:pPr>
+      <w:rPr>
+        <w:rFonts w:hint="default"/>
+      </w:rPr>
+    </w:lvl>
+  </w:abstractNum>
+  <w:abstractNum w:abstractNumId="4" w15:restartNumberingAfterBreak="0">
     <w:nsid w:val="71C01F37"/>
     <w:multiLevelType w:val="multilevel"/>
     <w:tmpl w:val="DCA65CFC"/>
@@ -20447,8 +21600,136 @@
       </w:pPr>
     </w:lvl>
   </w:abstractNum>
+  <w:abstractNum w:abstractNumId="5" w15:restartNumberingAfterBreak="0">
+    <w:nsid w:val="72C53D97"/>
+    <w:multiLevelType w:val="hybridMultilevel"/>
+    <w:tmpl w:val="C1CE8C4A"/>
+    <w:lvl w:ilvl="0" w:tplc="0B74E4D0">
+      <w:start w:val="1"/>
+      <w:numFmt w:val="bullet"/>
+      <w:lvlText w:val="-"/>
+      <w:lvlJc w:val="left"/>
+      <w:pPr>
+        <w:ind w:left="720" w:hanging="360"/>
+      </w:pPr>
+      <w:rPr>
+        <w:rFonts w:ascii="Arial" w:eastAsia="Arial" w:hAnsi="Arial" w:cs="Arial" w:hint="default"/>
+      </w:rPr>
+    </w:lvl>
+    <w:lvl w:ilvl="1" w:tplc="04090003" w:tentative="1">
+      <w:start w:val="1"/>
+      <w:numFmt w:val="bullet"/>
+      <w:lvlText w:val="o"/>
+      <w:lvlJc w:val="left"/>
+      <w:pPr>
+        <w:ind w:left="1440" w:hanging="360"/>
+      </w:pPr>
+      <w:rPr>
+        <w:rFonts w:ascii="Courier New" w:hAnsi="Courier New" w:cs="Courier New" w:hint="default"/>
+      </w:rPr>
+    </w:lvl>
+    <w:lvl w:ilvl="2" w:tplc="04090005" w:tentative="1">
+      <w:start w:val="1"/>
+      <w:numFmt w:val="bullet"/>
+      <w:lvlText w:val=""/>
+      <w:lvlJc w:val="left"/>
+      <w:pPr>
+        <w:ind w:left="2160" w:hanging="360"/>
+      </w:pPr>
+      <w:rPr>
+        <w:rFonts w:ascii="Wingdings" w:hAnsi="Wingdings" w:hint="default"/>
+      </w:rPr>
+    </w:lvl>
+    <w:lvl w:ilvl="3" w:tplc="04090001" w:tentative="1">
+      <w:start w:val="1"/>
+      <w:numFmt w:val="bullet"/>
+      <w:lvlText w:val=""/>
+      <w:lvlJc w:val="left"/>
+      <w:pPr>
+        <w:ind w:left="2880" w:hanging="360"/>
+      </w:pPr>
+      <w:rPr>
+        <w:rFonts w:ascii="Symbol" w:hAnsi="Symbol" w:hint="default"/>
+      </w:rPr>
+    </w:lvl>
+    <w:lvl w:ilvl="4" w:tplc="04090003" w:tentative="1">
+      <w:start w:val="1"/>
+      <w:numFmt w:val="bullet"/>
+      <w:lvlText w:val="o"/>
+      <w:lvlJc w:val="left"/>
+      <w:pPr>
+        <w:ind w:left="3600" w:hanging="360"/>
+      </w:pPr>
+      <w:rPr>
+        <w:rFonts w:ascii="Courier New" w:hAnsi="Courier New" w:cs="Courier New" w:hint="default"/>
+      </w:rPr>
+    </w:lvl>
+    <w:lvl w:ilvl="5" w:tplc="04090005" w:tentative="1">
+      <w:start w:val="1"/>
+      <w:numFmt w:val="bullet"/>
+      <w:lvlText w:val=""/>
+      <w:lvlJc w:val="left"/>
+      <w:pPr>
+        <w:ind w:left="4320" w:hanging="360"/>
+      </w:pPr>
+      <w:rPr>
+        <w:rFonts w:ascii="Wingdings" w:hAnsi="Wingdings" w:hint="default"/>
+      </w:rPr>
+    </w:lvl>
+    <w:lvl w:ilvl="6" w:tplc="04090001" w:tentative="1">
+      <w:start w:val="1"/>
+      <w:numFmt w:val="bullet"/>
+      <w:lvlText w:val=""/>
+      <w:lvlJc w:val="left"/>
+      <w:pPr>
+        <w:ind w:left="5040" w:hanging="360"/>
+      </w:pPr>
+      <w:rPr>
+        <w:rFonts w:ascii="Symbol" w:hAnsi="Symbol" w:hint="default"/>
+      </w:rPr>
+    </w:lvl>
+    <w:lvl w:ilvl="7" w:tplc="04090003" w:tentative="1">
+      <w:start w:val="1"/>
+      <w:numFmt w:val="bullet"/>
+      <w:lvlText w:val="o"/>
+      <w:lvlJc w:val="left"/>
+      <w:pPr>
+        <w:ind w:left="5760" w:hanging="360"/>
+      </w:pPr>
+      <w:rPr>
+        <w:rFonts w:ascii="Courier New" w:hAnsi="Courier New" w:cs="Courier New" w:hint="default"/>
+      </w:rPr>
+    </w:lvl>
+    <w:lvl w:ilvl="8" w:tplc="04090005" w:tentative="1">
+      <w:start w:val="1"/>
+      <w:numFmt w:val="bullet"/>
+      <w:lvlText w:val=""/>
+      <w:lvlJc w:val="left"/>
+      <w:pPr>
+        <w:ind w:left="6480" w:hanging="360"/>
+      </w:pPr>
+      <w:rPr>
+        <w:rFonts w:ascii="Wingdings" w:hAnsi="Wingdings" w:hint="default"/>
+      </w:rPr>
+    </w:lvl>
+  </w:abstractNum>
   <w:num w:numId="1" w16cid:durableId="554850350">
+    <w:abstractNumId w:val="4"/>
+  </w:num>
+  <w:num w:numId="2" w16cid:durableId="1108545927">
     <w:abstractNumId w:val="0"/>
+  </w:num>
+  <w:num w:numId="3" w16cid:durableId="2080445685">
+    <w:abstractNumId w:val="2"/>
+  </w:num>
+  <w:num w:numId="4" w16cid:durableId="427774324">
+    <w:abstractNumId w:val="5"/>
+  </w:num>
+  <w:num w:numId="5" w16cid:durableId="173233481">
+    <w:abstractNumId w:val="1"/>
+  </w:num>
+  <w:num w:numId="6" w16cid:durableId="2066174105">
+    <w:abstractNumId w:val="3"/>
   </w:num>
 </w:numbering>
 </file>

</xml_diff>